<commit_message>
chore: publica projeto One completo (prototipo-v1)
Adiciona o prototipo-visual completo (HTML/CSS/JS Vanilla + Bootstrap local, testes e relatorios), README raiz e .gitignore reforcado para repositorio publico, e consolida documentacao, requisitos e diagramas. Preserva a estrutura e o historico existente; nenhuma regra de negocio alterada.
</commit_message>
<xml_diff>
--- a/docs/requisitos/One_Levantamento_e_Requisitos.docx
+++ b/docs/requisitos/One_Levantamento_e_Requisitos.docx
@@ -11,7 +11,7 @@
           <w:noProof/>
         </w:rPr>
         <w:drawing>
-          <wp:inline distT="0" distB="0" distL="0" distR="0" wp14:anchorId="65735441" wp14:editId="1474239F">
+          <wp:inline distT="0" distB="0" distL="0" distR="0" wp14:anchorId="2B778DA0" wp14:editId="248102ED">
             <wp:extent cx="1800000" cy="745562"/>
             <wp:effectExtent l="0" t="0" r="0" b="0"/>
             <wp:docPr id="1" name="Picture 1"/>
@@ -267,13 +267,13 @@
     </w:p>
     <w:p>
       <w:r>
-        <w:t>Este documento apresenta o levantamento e a especificação dos requisitos do One, aplicação web progressiva de atendimento acadêmico desenvolvida no Projeto Extensionista Integrador IV do Curso Superior de Tecnologia em Análise e Desenvolvimento de Sistemas do UNIVAG. O problema tratado é o atendimento aos alunos disperso entre WhatsApp, e-mail e ambiente virtual de aprendizagem, sem registro das conversas, sem triagem das demandas e sem dados sobre o que os alunos mais perguntam. O levantamento combinou dua</w:t>
+        <w:t>Este trabalho apresenta o levantamento e a especificação de requisitos do One, uma aplicação web progressiva para o atendimento acadêmico, desenvolvida no Projeto Extensionista Integrador IV do Curso Superior de Tecnologia em Análise e Desenvolvimento de Sistemas do UNIVAG. Hoje os alunos falam com a coordenação pelo WhatsApp, por e-mail e pelo ambiente virtual de aprendizagem, e nada disso fica registrado. Também não há triagem dos pedidos nem dados sobre o que os alunos mais perguntam. Para levantar os re</w:t>
       </w:r>
       <w:r>
-        <w:t>s sessões de entrevista com a coordenadora dos cursos de tecnologia, uma pesquisa de mercado sobre plataformas de atendimento e a análise documental do manual da disciplina. Nos sete dias anteriores à segunda entrevista, a coordenação recebeu cerca de 256 mensagens de alunos, das quais metade eram demandas de fato. A partir desses dados, o documento define o escopo do produto mínimo viável, os requisitos funcionais rastreados às regras de negócio do projeto, os requisitos não funcionais, os casos de uso com</w:t>
+        <w:t>quisitos, entrevistamos a coordenadora dos cursos de tecnologia em duas sessões, fizemos uma pesquisa de mercado sobre plataformas de atendimento e analisamos o manual da disciplina. Na semana anterior à segunda entrevista, a coordenação recebeu cerca de 256 mensagens de alunos, e metade delas eram pedidos de fato. Com base nisso, definimos o escopo do produto mínimo viável e especificamos os requisitos funcionais, cada um ligado às regras de negócio do projeto, além dos requisitos não funcionais, dos casos</w:t>
       </w:r>
       <w:r>
-        <w:t xml:space="preserve"> suas especificações, o diagrama de classes e os modelos conceitual e lógico de dados. O fluxo central é: o aluno pergunta, o assistente tenta resolver a dúvida com base em artigos publicados pela instituição e, quando não resolve, a conversa se torna um chamado rastreável, encaminhado ao setor responsável sem que o aluno precise repetir o pedido. As questões ainda em aberto com a coordenação são tratadas como premissas a confirmar.</w:t>
+        <w:t xml:space="preserve"> de uso, do diagrama de classes e dos modelos conceitual e lógico de dados. No One, o aluno faz a pergunta e o assistente procura a resposta nos artigos publicados pela instituição. Se a resposta não resolver, a conversa vira um chamado registrado e segue para o setor responsável, sem que o aluno precise explicar tudo de novo. As questões que a coordenação ainda não respondeu aparecem no documento como premissas a confirmar.</w:t>
       </w:r>
     </w:p>
     <w:p>
@@ -321,7 +321,7 @@
       <w:r>
         <w:fldChar w:fldCharType="separate"/>
       </w:r>
-      <w:hyperlink w:anchor="_Toc241855250" w:history="1">
+      <w:hyperlink w:anchor="_Toc241857831" w:history="1">
         <w:r>
           <w:rPr>
             <w:rStyle w:val="Hyperlink"/>
@@ -349,7 +349,7 @@
             <w:noProof/>
             <w:webHidden/>
           </w:rPr>
-          <w:instrText xml:space="preserve"> PAGEREF _Toc241855250 \h </w:instrText>
+          <w:instrText xml:space="preserve"> PAGEREF _Toc241857831 \h </w:instrText>
         </w:r>
         <w:r>
           <w:rPr>
@@ -396,7 +396,7 @@
           <w14:ligatures w14:val="standardContextual"/>
         </w:rPr>
       </w:pPr>
-      <w:hyperlink w:anchor="_Toc241855251" w:history="1">
+      <w:hyperlink w:anchor="_Toc241857832" w:history="1">
         <w:r>
           <w:rPr>
             <w:rStyle w:val="Hyperlink"/>
@@ -424,7 +424,7 @@
             <w:noProof/>
             <w:webHidden/>
           </w:rPr>
-          <w:instrText xml:space="preserve"> PAGEREF _Toc241855251 \h </w:instrText>
+          <w:instrText xml:space="preserve"> PAGEREF _Toc241857832 \h </w:instrText>
         </w:r>
         <w:r>
           <w:rPr>
@@ -471,7 +471,7 @@
           <w14:ligatures w14:val="standardContextual"/>
         </w:rPr>
       </w:pPr>
-      <w:hyperlink w:anchor="_Toc241855252" w:history="1">
+      <w:hyperlink w:anchor="_Toc241857833" w:history="1">
         <w:r>
           <w:rPr>
             <w:rStyle w:val="Hyperlink"/>
@@ -499,7 +499,7 @@
             <w:noProof/>
             <w:webHidden/>
           </w:rPr>
-          <w:instrText xml:space="preserve"> PAGEREF _Toc241855252 \h </w:instrText>
+          <w:instrText xml:space="preserve"> PAGEREF _Toc241857833 \h </w:instrText>
         </w:r>
         <w:r>
           <w:rPr>
@@ -546,7 +546,7 @@
           <w14:ligatures w14:val="standardContextual"/>
         </w:rPr>
       </w:pPr>
-      <w:hyperlink w:anchor="_Toc241855253" w:history="1">
+      <w:hyperlink w:anchor="_Toc241857834" w:history="1">
         <w:r>
           <w:rPr>
             <w:rStyle w:val="Hyperlink"/>
@@ -574,7 +574,7 @@
             <w:noProof/>
             <w:webHidden/>
           </w:rPr>
-          <w:instrText xml:space="preserve"> PAGEREF _Toc241855253 \h </w:instrText>
+          <w:instrText xml:space="preserve"> PAGEREF _Toc241857834 \h </w:instrText>
         </w:r>
         <w:r>
           <w:rPr>
@@ -621,7 +621,7 @@
           <w14:ligatures w14:val="standardContextual"/>
         </w:rPr>
       </w:pPr>
-      <w:hyperlink w:anchor="_Toc241855254" w:history="1">
+      <w:hyperlink w:anchor="_Toc241857835" w:history="1">
         <w:r>
           <w:rPr>
             <w:rStyle w:val="Hyperlink"/>
@@ -649,7 +649,7 @@
             <w:noProof/>
             <w:webHidden/>
           </w:rPr>
-          <w:instrText xml:space="preserve"> PAGEREF _Toc241855254 \h </w:instrText>
+          <w:instrText xml:space="preserve"> PAGEREF _Toc241857835 \h </w:instrText>
         </w:r>
         <w:r>
           <w:rPr>
@@ -696,7 +696,7 @@
           <w14:ligatures w14:val="standardContextual"/>
         </w:rPr>
       </w:pPr>
-      <w:hyperlink w:anchor="_Toc241855255" w:history="1">
+      <w:hyperlink w:anchor="_Toc241857836" w:history="1">
         <w:r>
           <w:rPr>
             <w:rStyle w:val="Hyperlink"/>
@@ -724,7 +724,7 @@
             <w:noProof/>
             <w:webHidden/>
           </w:rPr>
-          <w:instrText xml:space="preserve"> PAGEREF _Toc241855255 \h </w:instrText>
+          <w:instrText xml:space="preserve"> PAGEREF _Toc241857836 \h </w:instrText>
         </w:r>
         <w:r>
           <w:rPr>
@@ -771,7 +771,7 @@
           <w14:ligatures w14:val="standardContextual"/>
         </w:rPr>
       </w:pPr>
-      <w:hyperlink w:anchor="_Toc241855256" w:history="1">
+      <w:hyperlink w:anchor="_Toc241857837" w:history="1">
         <w:r>
           <w:rPr>
             <w:rStyle w:val="Hyperlink"/>
@@ -799,7 +799,7 @@
             <w:noProof/>
             <w:webHidden/>
           </w:rPr>
-          <w:instrText xml:space="preserve"> PAGEREF _Toc241855256 \h </w:instrText>
+          <w:instrText xml:space="preserve"> PAGEREF _Toc241857837 \h </w:instrText>
         </w:r>
         <w:r>
           <w:rPr>
@@ -846,7 +846,7 @@
           <w14:ligatures w14:val="standardContextual"/>
         </w:rPr>
       </w:pPr>
-      <w:hyperlink w:anchor="_Toc241855257" w:history="1">
+      <w:hyperlink w:anchor="_Toc241857838" w:history="1">
         <w:r>
           <w:rPr>
             <w:rStyle w:val="Hyperlink"/>
@@ -874,7 +874,7 @@
             <w:noProof/>
             <w:webHidden/>
           </w:rPr>
-          <w:instrText xml:space="preserve"> PAGEREF _Toc241855257 \h </w:instrText>
+          <w:instrText xml:space="preserve"> PAGEREF _Toc241857838 \h </w:instrText>
         </w:r>
         <w:r>
           <w:rPr>
@@ -921,7 +921,7 @@
           <w14:ligatures w14:val="standardContextual"/>
         </w:rPr>
       </w:pPr>
-      <w:hyperlink w:anchor="_Toc241855258" w:history="1">
+      <w:hyperlink w:anchor="_Toc241857839" w:history="1">
         <w:r>
           <w:rPr>
             <w:rStyle w:val="Hyperlink"/>
@@ -949,7 +949,7 @@
             <w:noProof/>
             <w:webHidden/>
           </w:rPr>
-          <w:instrText xml:space="preserve"> PAGEREF _Toc241855258 \h </w:instrText>
+          <w:instrText xml:space="preserve"> PAGEREF _Toc241857839 \h </w:instrText>
         </w:r>
         <w:r>
           <w:rPr>
@@ -996,7 +996,7 @@
           <w14:ligatures w14:val="standardContextual"/>
         </w:rPr>
       </w:pPr>
-      <w:hyperlink w:anchor="_Toc241855259" w:history="1">
+      <w:hyperlink w:anchor="_Toc241857840" w:history="1">
         <w:r>
           <w:rPr>
             <w:rStyle w:val="Hyperlink"/>
@@ -1024,7 +1024,7 @@
             <w:noProof/>
             <w:webHidden/>
           </w:rPr>
-          <w:instrText xml:space="preserve"> PAGEREF _Toc241855259 \h </w:instrText>
+          <w:instrText xml:space="preserve"> PAGEREF _Toc241857840 \h </w:instrText>
         </w:r>
         <w:r>
           <w:rPr>
@@ -1071,7 +1071,7 @@
           <w14:ligatures w14:val="standardContextual"/>
         </w:rPr>
       </w:pPr>
-      <w:hyperlink w:anchor="_Toc241855260" w:history="1">
+      <w:hyperlink w:anchor="_Toc241857841" w:history="1">
         <w:r>
           <w:rPr>
             <w:rStyle w:val="Hyperlink"/>
@@ -1099,7 +1099,7 @@
             <w:noProof/>
             <w:webHidden/>
           </w:rPr>
-          <w:instrText xml:space="preserve"> PAGEREF _Toc241855260 \h </w:instrText>
+          <w:instrText xml:space="preserve"> PAGEREF _Toc241857841 \h </w:instrText>
         </w:r>
         <w:r>
           <w:rPr>
@@ -1146,7 +1146,7 @@
           <w14:ligatures w14:val="standardContextual"/>
         </w:rPr>
       </w:pPr>
-      <w:hyperlink w:anchor="_Toc241855261" w:history="1">
+      <w:hyperlink w:anchor="_Toc241857842" w:history="1">
         <w:r>
           <w:rPr>
             <w:rStyle w:val="Hyperlink"/>
@@ -1174,7 +1174,7 @@
             <w:noProof/>
             <w:webHidden/>
           </w:rPr>
-          <w:instrText xml:space="preserve"> PAGEREF _Toc241855261 \h </w:instrText>
+          <w:instrText xml:space="preserve"> PAGEREF _Toc241857842 \h </w:instrText>
         </w:r>
         <w:r>
           <w:rPr>
@@ -1221,7 +1221,7 @@
           <w14:ligatures w14:val="standardContextual"/>
         </w:rPr>
       </w:pPr>
-      <w:hyperlink w:anchor="_Toc241855262" w:history="1">
+      <w:hyperlink w:anchor="_Toc241857843" w:history="1">
         <w:r>
           <w:rPr>
             <w:rStyle w:val="Hyperlink"/>
@@ -1249,7 +1249,7 @@
             <w:noProof/>
             <w:webHidden/>
           </w:rPr>
-          <w:instrText xml:space="preserve"> PAGEREF _Toc241855262 \h </w:instrText>
+          <w:instrText xml:space="preserve"> PAGEREF _Toc241857843 \h </w:instrText>
         </w:r>
         <w:r>
           <w:rPr>
@@ -1296,7 +1296,7 @@
           <w14:ligatures w14:val="standardContextual"/>
         </w:rPr>
       </w:pPr>
-      <w:hyperlink w:anchor="_Toc241855263" w:history="1">
+      <w:hyperlink w:anchor="_Toc241857844" w:history="1">
         <w:r>
           <w:rPr>
             <w:rStyle w:val="Hyperlink"/>
@@ -1324,7 +1324,7 @@
             <w:noProof/>
             <w:webHidden/>
           </w:rPr>
-          <w:instrText xml:space="preserve"> PAGEREF _Toc241855263 \h </w:instrText>
+          <w:instrText xml:space="preserve"> PAGEREF _Toc241857844 \h </w:instrText>
         </w:r>
         <w:r>
           <w:rPr>
@@ -1371,7 +1371,7 @@
           <w14:ligatures w14:val="standardContextual"/>
         </w:rPr>
       </w:pPr>
-      <w:hyperlink w:anchor="_Toc241855264" w:history="1">
+      <w:hyperlink w:anchor="_Toc241857845" w:history="1">
         <w:r>
           <w:rPr>
             <w:rStyle w:val="Hyperlink"/>
@@ -1399,7 +1399,7 @@
             <w:noProof/>
             <w:webHidden/>
           </w:rPr>
-          <w:instrText xml:space="preserve"> PAGEREF _Toc241855264 \h </w:instrText>
+          <w:instrText xml:space="preserve"> PAGEREF _Toc241857845 \h </w:instrText>
         </w:r>
         <w:r>
           <w:rPr>
@@ -1446,7 +1446,7 @@
           <w14:ligatures w14:val="standardContextual"/>
         </w:rPr>
       </w:pPr>
-      <w:hyperlink w:anchor="_Toc241855265" w:history="1">
+      <w:hyperlink w:anchor="_Toc241857846" w:history="1">
         <w:r>
           <w:rPr>
             <w:rStyle w:val="Hyperlink"/>
@@ -1474,7 +1474,7 @@
             <w:noProof/>
             <w:webHidden/>
           </w:rPr>
-          <w:instrText xml:space="preserve"> PAGEREF _Toc241855265 \h </w:instrText>
+          <w:instrText xml:space="preserve"> PAGEREF _Toc241857846 \h </w:instrText>
         </w:r>
         <w:r>
           <w:rPr>
@@ -1521,7 +1521,7 @@
           <w14:ligatures w14:val="standardContextual"/>
         </w:rPr>
       </w:pPr>
-      <w:hyperlink w:anchor="_Toc241855266" w:history="1">
+      <w:hyperlink w:anchor="_Toc241857847" w:history="1">
         <w:r>
           <w:rPr>
             <w:rStyle w:val="Hyperlink"/>
@@ -1549,7 +1549,7 @@
             <w:noProof/>
             <w:webHidden/>
           </w:rPr>
-          <w:instrText xml:space="preserve"> PAGEREF _Toc241855266 \h </w:instrText>
+          <w:instrText xml:space="preserve"> PAGEREF _Toc241857847 \h </w:instrText>
         </w:r>
         <w:r>
           <w:rPr>
@@ -1596,7 +1596,7 @@
           <w14:ligatures w14:val="standardContextual"/>
         </w:rPr>
       </w:pPr>
-      <w:hyperlink w:anchor="_Toc241855267" w:history="1">
+      <w:hyperlink w:anchor="_Toc241857848" w:history="1">
         <w:r>
           <w:rPr>
             <w:rStyle w:val="Hyperlink"/>
@@ -1624,7 +1624,7 @@
             <w:noProof/>
             <w:webHidden/>
           </w:rPr>
-          <w:instrText xml:space="preserve"> PAGEREF _Toc241855267 \h </w:instrText>
+          <w:instrText xml:space="preserve"> PAGEREF _Toc241857848 \h </w:instrText>
         </w:r>
         <w:r>
           <w:rPr>
@@ -1671,7 +1671,7 @@
           <w14:ligatures w14:val="standardContextual"/>
         </w:rPr>
       </w:pPr>
-      <w:hyperlink w:anchor="_Toc241855268" w:history="1">
+      <w:hyperlink w:anchor="_Toc241857849" w:history="1">
         <w:r>
           <w:rPr>
             <w:rStyle w:val="Hyperlink"/>
@@ -1699,7 +1699,7 @@
             <w:noProof/>
             <w:webHidden/>
           </w:rPr>
-          <w:instrText xml:space="preserve"> PAGEREF _Toc241855268 \h </w:instrText>
+          <w:instrText xml:space="preserve"> PAGEREF _Toc241857849 \h </w:instrText>
         </w:r>
         <w:r>
           <w:rPr>
@@ -1746,7 +1746,7 @@
           <w14:ligatures w14:val="standardContextual"/>
         </w:rPr>
       </w:pPr>
-      <w:hyperlink w:anchor="_Toc241855269" w:history="1">
+      <w:hyperlink w:anchor="_Toc241857850" w:history="1">
         <w:r>
           <w:rPr>
             <w:rStyle w:val="Hyperlink"/>
@@ -1774,7 +1774,7 @@
             <w:noProof/>
             <w:webHidden/>
           </w:rPr>
-          <w:instrText xml:space="preserve"> PAGEREF _Toc241855269 \h </w:instrText>
+          <w:instrText xml:space="preserve"> PAGEREF _Toc241857850 \h </w:instrText>
         </w:r>
         <w:r>
           <w:rPr>
@@ -1821,7 +1821,7 @@
           <w14:ligatures w14:val="standardContextual"/>
         </w:rPr>
       </w:pPr>
-      <w:hyperlink w:anchor="_Toc241855270" w:history="1">
+      <w:hyperlink w:anchor="_Toc241857851" w:history="1">
         <w:r>
           <w:rPr>
             <w:rStyle w:val="Hyperlink"/>
@@ -1849,7 +1849,7 @@
             <w:noProof/>
             <w:webHidden/>
           </w:rPr>
-          <w:instrText xml:space="preserve"> PAGEREF _Toc241855270 \h </w:instrText>
+          <w:instrText xml:space="preserve"> PAGEREF _Toc241857851 \h </w:instrText>
         </w:r>
         <w:r>
           <w:rPr>
@@ -1896,7 +1896,7 @@
           <w14:ligatures w14:val="standardContextual"/>
         </w:rPr>
       </w:pPr>
-      <w:hyperlink w:anchor="_Toc241855271" w:history="1">
+      <w:hyperlink w:anchor="_Toc241857852" w:history="1">
         <w:r>
           <w:rPr>
             <w:rStyle w:val="Hyperlink"/>
@@ -1924,7 +1924,7 @@
             <w:noProof/>
             <w:webHidden/>
           </w:rPr>
-          <w:instrText xml:space="preserve"> PAGEREF _Toc241855271 \h </w:instrText>
+          <w:instrText xml:space="preserve"> PAGEREF _Toc241857852 \h </w:instrText>
         </w:r>
         <w:r>
           <w:rPr>
@@ -1971,7 +1971,7 @@
           <w14:ligatures w14:val="standardContextual"/>
         </w:rPr>
       </w:pPr>
-      <w:hyperlink w:anchor="_Toc241855272" w:history="1">
+      <w:hyperlink w:anchor="_Toc241857853" w:history="1">
         <w:r>
           <w:rPr>
             <w:rStyle w:val="Hyperlink"/>
@@ -1999,7 +1999,7 @@
             <w:noProof/>
             <w:webHidden/>
           </w:rPr>
-          <w:instrText xml:space="preserve"> PAGEREF _Toc241855272 \h </w:instrText>
+          <w:instrText xml:space="preserve"> PAGEREF _Toc241857853 \h </w:instrText>
         </w:r>
         <w:r>
           <w:rPr>
@@ -2046,7 +2046,7 @@
           <w14:ligatures w14:val="standardContextual"/>
         </w:rPr>
       </w:pPr>
-      <w:hyperlink w:anchor="_Toc241855273" w:history="1">
+      <w:hyperlink w:anchor="_Toc241857854" w:history="1">
         <w:r>
           <w:rPr>
             <w:rStyle w:val="Hyperlink"/>
@@ -2074,7 +2074,7 @@
             <w:noProof/>
             <w:webHidden/>
           </w:rPr>
-          <w:instrText xml:space="preserve"> PAGEREF _Toc241855273 \h </w:instrText>
+          <w:instrText xml:space="preserve"> PAGEREF _Toc241857854 \h </w:instrText>
         </w:r>
         <w:r>
           <w:rPr>
@@ -2121,7 +2121,7 @@
           <w14:ligatures w14:val="standardContextual"/>
         </w:rPr>
       </w:pPr>
-      <w:hyperlink w:anchor="_Toc241855274" w:history="1">
+      <w:hyperlink w:anchor="_Toc241857855" w:history="1">
         <w:r>
           <w:rPr>
             <w:rStyle w:val="Hyperlink"/>
@@ -2149,7 +2149,7 @@
             <w:noProof/>
             <w:webHidden/>
           </w:rPr>
-          <w:instrText xml:space="preserve"> PAGEREF _Toc241855274 \h </w:instrText>
+          <w:instrText xml:space="preserve"> PAGEREF _Toc241857855 \h </w:instrText>
         </w:r>
         <w:r>
           <w:rPr>
@@ -2169,7 +2169,7 @@
             <w:noProof/>
             <w:webHidden/>
           </w:rPr>
-          <w:t>27</w:t>
+          <w:t>28</w:t>
         </w:r>
         <w:r>
           <w:rPr>
@@ -2196,7 +2196,7 @@
           <w14:ligatures w14:val="standardContextual"/>
         </w:rPr>
       </w:pPr>
-      <w:hyperlink w:anchor="_Toc241855275" w:history="1">
+      <w:hyperlink w:anchor="_Toc241857856" w:history="1">
         <w:r>
           <w:rPr>
             <w:rStyle w:val="Hyperlink"/>
@@ -2224,7 +2224,7 @@
             <w:noProof/>
             <w:webHidden/>
           </w:rPr>
-          <w:instrText xml:space="preserve"> PAGEREF _Toc241855275 \h </w:instrText>
+          <w:instrText xml:space="preserve"> PAGEREF _Toc241857856 \h </w:instrText>
         </w:r>
         <w:r>
           <w:rPr>
@@ -2271,7 +2271,7 @@
           <w14:ligatures w14:val="standardContextual"/>
         </w:rPr>
       </w:pPr>
-      <w:hyperlink w:anchor="_Toc241855276" w:history="1">
+      <w:hyperlink w:anchor="_Toc241857857" w:history="1">
         <w:r>
           <w:rPr>
             <w:rStyle w:val="Hyperlink"/>
@@ -2299,7 +2299,7 @@
             <w:noProof/>
             <w:webHidden/>
           </w:rPr>
-          <w:instrText xml:space="preserve"> PAGEREF _Toc241855276 \h </w:instrText>
+          <w:instrText xml:space="preserve"> PAGEREF _Toc241857857 \h </w:instrText>
         </w:r>
         <w:r>
           <w:rPr>
@@ -2346,7 +2346,7 @@
           <w14:ligatures w14:val="standardContextual"/>
         </w:rPr>
       </w:pPr>
-      <w:hyperlink w:anchor="_Toc241855277" w:history="1">
+      <w:hyperlink w:anchor="_Toc241857858" w:history="1">
         <w:r>
           <w:rPr>
             <w:rStyle w:val="Hyperlink"/>
@@ -2374,7 +2374,7 @@
             <w:noProof/>
             <w:webHidden/>
           </w:rPr>
-          <w:instrText xml:space="preserve"> PAGEREF _Toc241855277 \h </w:instrText>
+          <w:instrText xml:space="preserve"> PAGEREF _Toc241857858 \h </w:instrText>
         </w:r>
         <w:r>
           <w:rPr>
@@ -2425,7 +2425,7 @@
       <w:pPr>
         <w:pStyle w:val="Heading1"/>
       </w:pPr>
-      <w:bookmarkStart w:id="0" w:name="_Toc241855250"/>
+      <w:bookmarkStart w:id="0" w:name="_Toc241857831"/>
       <w:r>
         <w:lastRenderedPageBreak/>
         <w:t>1 INTRODUÇÃO</w:t>
@@ -2434,19 +2434,22 @@
     </w:p>
     <w:p>
       <w:r>
-        <w:t>O atendimento acadêmico de uma instituição de ensino superior envolve dúvidas e pedidos que chegam por muitos canais e são resolvidos por pessoas diferentes: coordenação, professores, secretaria e a Central de Atendimento ao Estudante. Quando esses pedidos chegam por mensagens informais, a instituição não sabe quem recebeu cada pedido, quem está cuidando dele, quanto tempo levou nem se foi resolvido. O aluno, por sua vez, não sabe a quem recorrer e precisa repetir a história a cada redirecionamento.</w:t>
+        <w:t>No atendimento acadêmico, as dúvidas e os pedidos dos alunos chegam por vários canais, e quem resolve muda conforme o assunto: a coordenação, os professores, a secretaria ou a Central de Atendimento ao Estudante (CAE). Quando tudo chega por mensagem informal, a instituição perde o controle de quem recebeu cada pedido, de quem está cuidando dele e de quanto tempo levou para resolver, quando chega a ser resolvido. O aluno, por sua vez, nem sempre sabe a quem recorrer e, a cada redirecionamento, precisa contar</w:t>
+      </w:r>
+      <w:r>
+        <w:t xml:space="preserve"> a história de novo.</w:t>
       </w:r>
     </w:p>
     <w:p>
       <w:r>
-        <w:t>O One é a proposta do grupo para esse problema: um único ponto de contato em que o aluno descreve o que precisa em linguagem natural, recebe uma resposta imediata quando ela já existe e, quando não existe, tem o pedido registrado e direcionado ao setor certo. A ideia que orienta o produto é que o aluno não precisa saber quem resolve; o sistema precisa.</w:t>
+        <w:t>O One é a nossa proposta para esse problema. O aluno descreve o que precisa com as próprias palavras e, se a resposta já existe, recebe na hora. Se não existe, o pedido fica registrado e segue para o setor certo. Desde o começo do projeto usamos uma frase para resumir a ideia: "o aluno não precisa saber quem resolve; o One precisa".</w:t>
       </w:r>
     </w:p>
     <w:p>
       <w:pPr>
         <w:pStyle w:val="Heading2"/>
       </w:pPr>
-      <w:bookmarkStart w:id="1" w:name="_Toc241855251"/>
+      <w:bookmarkStart w:id="1" w:name="_Toc241857832"/>
       <w:r>
         <w:t>1.1 PROPÓSITO DO DOCUMENTO</w:t>
       </w:r>
@@ -2454,19 +2457,19 @@
     </w:p>
     <w:p>
       <w:r>
-        <w:t>Este documento registra como os requisitos do One foram levantados e especifica o que o produto mínimo viável deve fazer. Ele corresponde à entrega de elicitação de requisitos do produto prevista para o Projeto Extensionista Integrador IV (UNIVAG, 2026) e serve de base para o protótipo, para a implementação e para a avaliação do piloto.</w:t>
+        <w:t>Este documento registra como levantamos os requisitos do One e especifica o que o produto mínimo viável deve fazer. Ele corresponde à entrega de elicitação de requisitos do produto prevista para o Projeto Extensionista Integrador IV (UNIVAG, 2026) e vai servir de base para o protótipo, para a implementação e para a avaliação do piloto.</w:t>
       </w:r>
     </w:p>
     <w:p>
       <w:r>
-        <w:t>Os leitores previstos são o professor orientador, que avalia a entrega; os integrantes do grupo, que implementam o sistema; e a coordenação dos cursos de tecnologia, que valida as premissas adotadas.</w:t>
+        <w:t>Escrevemos pensando em três leitores: o professor orientador, que avalia a entrega; os integrantes do grupo, que vão implementar o sistema; e a coordenação dos cursos de tecnologia, que precisa validar as premissas que adotamos.</w:t>
       </w:r>
     </w:p>
     <w:p>
       <w:pPr>
         <w:pStyle w:val="Heading2"/>
       </w:pPr>
-      <w:bookmarkStart w:id="2" w:name="_Toc241855252"/>
+      <w:bookmarkStart w:id="2" w:name="_Toc241857833"/>
       <w:r>
         <w:t>1.2 ESCOPO DO PRODUTO</w:t>
       </w:r>
@@ -2474,18 +2477,18 @@
     </w:p>
     <w:p>
       <w:r>
-        <w:t>O produto mínimo viável cobre um único fluxo, do início ao fim: perguntar, tentar resolver, registrar, direcionar, atender, resolver e medir. Para isso, ele reúne oito módulos: identidade e acesso; base de conhecimento; assistente que responde somente a partir da base; conversão da conversa em chamado; roteamento por categoria; ciclo de vida e atendimento do chamado; histórico auditável; e indicadores.</w:t>
-      </w:r>
-    </w:p>
-    <w:p>
-      <w:r>
-        <w:t>O piloto previsto envolve uma instituição (Univag), uma coordenação (cursos de tecnologia), os alunos de Análise e Desenvolvimento de Sistemas, até três setores e de dez a trinta artigos na base de conhecimento.</w:t>
+        <w:t>O produto mínimo viável cobre um único fluxo do começo ao fim: o aluno pergunta, o sistema tenta resolver, registra o pedido e o encaminha ao setor, o atendente resolve e os resultados são medidos. Para isso, o produto tem oito módulos: identidade e acesso; base de conhecimento; assistente que só responde a partir da base; transformação da conversa em chamado; roteamento por categoria; ciclo de vida e atendimento do chamado; histórico auditável; e indicadores.</w:t>
       </w:r>
     </w:p>
     <w:p>
       <w:r>
         <w:lastRenderedPageBreak/>
-        <w:t>Ficam fora do escopo do produto mínimo viável:</w:t>
+        <w:t>O piloto previsto é pequeno. Ele envolve uma instituição (o Univag), uma coordenação (a dos cursos de tecnologia), os alunos de Análise e Desenvolvimento de Sistemas, até três setores e de dez a trinta artigos na base de conhecimento.</w:t>
+      </w:r>
+    </w:p>
+    <w:p>
+      <w:r>
+        <w:t>Deixamos de fora do produto mínimo viável:</w:t>
       </w:r>
     </w:p>
     <w:p>
@@ -2493,7 +2496,25 @@
         <w:pStyle w:val="ListBullet"/>
       </w:pPr>
       <w:r>
-        <w:t>aplicativo nativo, atendimento pelo WhatsApp, notificações push e chat em tempo real;</w:t>
+        <w:t xml:space="preserve">aplicativo nativo, atendimento pelo WhatsApp, notificações </w:t>
+      </w:r>
+      <w:r>
+        <w:rPr>
+          <w:i/>
+        </w:rPr>
+        <w:t>push</w:t>
+      </w:r>
+      <w:r>
+        <w:t xml:space="preserve"> e </w:t>
+      </w:r>
+      <w:r>
+        <w:rPr>
+          <w:i/>
+        </w:rPr>
+        <w:t>chat</w:t>
+      </w:r>
+      <w:r>
+        <w:t xml:space="preserve"> em tempo real;</w:t>
       </w:r>
     </w:p>
     <w:p>
@@ -2501,7 +2522,7 @@
         <w:pStyle w:val="ListBullet"/>
       </w:pPr>
       <w:r>
-        <w:t>integrações com Moodle, sistema acadêmico, Portal do Aluno ou sistema financeiro;</w:t>
+        <w:t>integrações com o Moodle, o sistema acadêmico, o Portal do Aluno ou o sistema financeiro;</w:t>
       </w:r>
     </w:p>
     <w:p>
@@ -2509,7 +2530,7 @@
         <w:pStyle w:val="ListBullet"/>
       </w:pPr>
       <w:r>
-        <w:t>prioridade de chamados e acordos de nível de serviço;</w:t>
+        <w:t>prioridade de chamados e acordos de nível de serviço (SLA);</w:t>
       </w:r>
     </w:p>
     <w:p>
@@ -2540,7 +2561,7 @@
       <w:pPr>
         <w:pStyle w:val="Heading2"/>
       </w:pPr>
-      <w:bookmarkStart w:id="3" w:name="_Toc241855253"/>
+      <w:bookmarkStart w:id="3" w:name="_Toc241857834"/>
       <w:r>
         <w:t>1.3 PREMISSAS DO PROJETO</w:t>
       </w:r>
@@ -2548,10 +2569,10 @@
     </w:p>
     <w:p>
       <w:r>
-        <w:t xml:space="preserve">Parte das decisões depende de respostas da coordenação que ainda não foram dadas. Para cumprir o calendário da disciplina, o grupo adotou uma premissa para cada questão em aberto, apresentada no Quadro 1. Cada premissa será </w:t>
+        <w:t xml:space="preserve">Algumas decisões dependem de respostas da coordenação que ainda não chegaram. Para não atrasar o </w:t>
       </w:r>
       <w:r>
-        <w:t>substituída pela resposta da coordenação assim que ela for obtida.</w:t>
+        <w:t>calendário da disciplina, adotamos uma premissa para cada questão em aberto, como mostra o Quadro 1. Quando a coordenação responder, a resposta dela substitui a premissa.</w:t>
       </w:r>
     </w:p>
     <w:p>
@@ -2685,10 +2706,16 @@
               <w:pStyle w:val="Tabela"/>
             </w:pPr>
             <w:r>
-              <w:t xml:space="preserve">Contas locais criadas pelo administrador, individualmente ou por </w:t>
-            </w:r>
-            <w:r>
-              <w:t>importação em lote; sem login institucional no piloto</w:t>
+              <w:t xml:space="preserve">Contas locais criadas pelo administrador, uma a uma ou por importação em lote; no piloto não há </w:t>
+            </w:r>
+            <w:r>
+              <w:rPr>
+                <w:i/>
+              </w:rPr>
+              <w:t>login</w:t>
+            </w:r>
+            <w:r>
+              <w:t xml:space="preserve"> institucional</w:t>
             </w:r>
           </w:p>
         </w:tc>
@@ -2745,7 +2772,10 @@
               <w:pStyle w:val="Tabela"/>
             </w:pPr>
             <w:r>
-              <w:t>A conversa sem resposta do aluno por 30 minutos é encerrada como abandonada</w:t>
+              <w:t xml:space="preserve">A conversa em que o aluno não responde por 30 </w:t>
+            </w:r>
+            <w:r>
+              <w:t>minutos é encerrada como abandonada</w:t>
             </w:r>
           </w:p>
         </w:tc>
@@ -2859,10 +2889,7 @@
               <w:pStyle w:val="Tabela"/>
             </w:pPr>
             <w:r>
-              <w:t xml:space="preserve">Qualquer atendente do setor pode assumir um chamado atribuído a um colega, com registro no </w:t>
-            </w:r>
-            <w:r>
-              <w:t>histórico</w:t>
+              <w:t>Qualquer atendente do setor pode assumir um chamado atribuído a um colega, e a troca fica no histórico</w:t>
             </w:r>
           </w:p>
         </w:tc>
@@ -2919,7 +2946,7 @@
               <w:pStyle w:val="Tabela"/>
             </w:pPr>
             <w:r>
-              <w:t>Permitidos nas respostas públicas: PDF, JPG e PNG, até 10 MB cada</w:t>
+              <w:t>Permitidos nas respostas públicas: PDF, JPG e PNG, com até 10 MB cada</w:t>
             </w:r>
           </w:p>
         </w:tc>
@@ -2932,7 +2959,10 @@
               <w:pStyle w:val="Tabela"/>
             </w:pPr>
             <w:r>
-              <w:t>a confirmar com a coordenação</w:t>
+              <w:t xml:space="preserve">a confirmar com a </w:t>
+            </w:r>
+            <w:r>
+              <w:t>coordenação</w:t>
             </w:r>
           </w:p>
         </w:tc>
@@ -2976,7 +3006,7 @@
               <w:pStyle w:val="Tabela"/>
             </w:pPr>
             <w:r>
-              <w:t>Tempos medidos em tempo corrido, sem descontar horário fora do expediente</w:t>
+              <w:t>Os tempos são medidos em tempo corrido, sem descontar o horário fora do expediente</w:t>
             </w:r>
           </w:p>
         </w:tc>
@@ -3007,6 +3037,7 @@
               <w:pStyle w:val="Tabela"/>
             </w:pPr>
             <w:r>
+              <w:lastRenderedPageBreak/>
               <w:t>Q11</w:t>
             </w:r>
           </w:p>
@@ -3090,7 +3121,7 @@
               <w:pStyle w:val="Tabela"/>
             </w:pPr>
             <w:r>
-              <w:t>O painel de indicadores é visto apenas pelo administrador</w:t>
+              <w:t>Só o administrador vê o painel de indicadores</w:t>
             </w:r>
           </w:p>
         </w:tc>
@@ -3147,7 +3178,10 @@
               <w:pStyle w:val="Tabela"/>
             </w:pPr>
             <w:r>
-              <w:t>As mensagens dos alunos podem ser processadas por um provedor externo de IA, com aviso visível; anexos nunca são enviados</w:t>
+              <w:t xml:space="preserve">As mensagens dos alunos podem ser processadas por um provedor externo de IA, com aviso </w:t>
+            </w:r>
+            <w:r>
+              <w:t>visível; os anexos nunca são enviados</w:t>
             </w:r>
           </w:p>
         </w:tc>
@@ -3178,7 +3212,6 @@
               <w:pStyle w:val="Tabela"/>
             </w:pPr>
             <w:r>
-              <w:lastRenderedPageBreak/>
               <w:t>Q14</w:t>
             </w:r>
           </w:p>
@@ -3205,10 +3238,7 @@
               <w:pStyle w:val="Tabela"/>
             </w:pPr>
             <w:r>
-              <w:t xml:space="preserve">Não são modelados no </w:t>
-            </w:r>
-            <w:r>
-              <w:t>produto mínimo viável</w:t>
+              <w:t>Os representantes não entram no produto mínimo viável</w:t>
             </w:r>
           </w:p>
         </w:tc>
@@ -3265,7 +3295,10 @@
               <w:pStyle w:val="Tabela"/>
             </w:pPr>
             <w:r>
-              <w:t>O histórico é mantido sem exclusão; o prazo de retenção e o formato exigido pelo MEC estão pendentes</w:t>
+              <w:t xml:space="preserve">O histórico é mantido sem exclusão; ainda </w:t>
+            </w:r>
+            <w:r>
+              <w:t>faltam o prazo de retenção e o formato que o MEC exige</w:t>
             </w:r>
           </w:p>
         </w:tc>
@@ -3322,10 +3355,7 @@
               <w:pStyle w:val="Tabela"/>
             </w:pPr>
             <w:r>
-              <w:t xml:space="preserve">As categorias </w:t>
-            </w:r>
-            <w:r>
-              <w:t>iniciais vêm do Quadro 6; o volume de cada tipo está pendente</w:t>
+              <w:t>As categorias iniciais saem do Quadro 6; ainda falta o volume de cada tipo</w:t>
             </w:r>
           </w:p>
         </w:tc>
@@ -3382,7 +3412,7 @@
               <w:pStyle w:val="Tabela"/>
             </w:pPr>
             <w:r>
-              <w:t>Os valores do Quadro 5 são a referência para comparar o piloto; alguns pontos estão pendentes</w:t>
+              <w:t>Os valores do Quadro 5 são a referência para comparar o piloto; alguns pontos ainda estão pendentes</w:t>
             </w:r>
           </w:p>
         </w:tc>
@@ -3426,10 +3456,7 @@
               <w:pStyle w:val="Tabela"/>
             </w:pPr>
             <w:r>
-              <w:t xml:space="preserve">Demandas do </w:t>
-            </w:r>
-            <w:r>
-              <w:t>professor</w:t>
+              <w:t>Demandas do professor</w:t>
             </w:r>
           </w:p>
         </w:tc>
@@ -3442,7 +3469,7 @@
               <w:pStyle w:val="Tabela"/>
             </w:pPr>
             <w:r>
-              <w:t>Não são roteadas ao professor; um artigo orienta o aluno a procurá-lo diretamente</w:t>
+              <w:t>Essas demandas não são roteadas ao professor; um artigo orienta o aluno a procurá-lo diretamente</w:t>
             </w:r>
           </w:p>
         </w:tc>
@@ -3455,7 +3482,10 @@
               <w:pStyle w:val="Tabela"/>
             </w:pPr>
             <w:r>
-              <w:t>a confirmar com a coordenação</w:t>
+              <w:t xml:space="preserve">a confirmar com a </w:t>
+            </w:r>
+            <w:r>
+              <w:t>coordenação</w:t>
             </w:r>
           </w:p>
         </w:tc>
@@ -3530,7 +3560,7 @@
       <w:pPr>
         <w:pStyle w:val="Heading2"/>
       </w:pPr>
-      <w:bookmarkStart w:id="4" w:name="_Toc241855254"/>
+      <w:bookmarkStart w:id="4" w:name="_Toc241857835"/>
       <w:r>
         <w:t>1.4 CONVENÇÕES, TERMOS E ABREVIAÇÕES</w:t>
       </w:r>
@@ -3538,7 +3568,7 @@
     </w:p>
     <w:p>
       <w:r>
-        <w:t>Os requisitos funcionais são identificados por RF-NN, os não funcionais por RNF-NN e os casos de uso por UC-NN. Cada requisito funcional indica, na coluna Origem, as regras da especificação de negócio do projeto de que deriva: regras BR (por exemplo, BR-A1) e transições de estado do chamado F1 a F9. Os termos usados no documento estão no Quadro 2 e as abreviações no Quadro 3.</w:t>
+        <w:t>Os requisitos funcionais aparecem como RF-NN, os não funcionais como RNF-NN e os casos de uso como UC-NN. Na coluna Origem, cada requisito funcional indica de quais regras da especificação de negócio do projeto ele vem: as regras BR (por exemplo, BR-A1) e as transições de estado do chamado, de F1 a F9. Os termos do domínio estão no Quadro 2 e as abreviações no Quadro 3.</w:t>
       </w:r>
     </w:p>
     <w:p>
@@ -3629,10 +3659,7 @@
               <w:keepNext/>
             </w:pPr>
             <w:r>
-              <w:t xml:space="preserve">Usuário </w:t>
-            </w:r>
-            <w:r>
-              <w:t>final que faz perguntas e é dono dos seus chamados</w:t>
+              <w:t>Usuário que faz as perguntas e é dono dos seus chamados</w:t>
             </w:r>
           </w:p>
         </w:tc>
@@ -3665,7 +3692,10 @@
               <w:keepNext/>
             </w:pPr>
             <w:r>
-              <w:t>Funcionário que atende os chamados dos setores a que pertence</w:t>
+              <w:t xml:space="preserve">Funcionário que atende os chamados dos setores a que </w:t>
+            </w:r>
+            <w:r>
+              <w:t>pertence</w:t>
             </w:r>
           </w:p>
         </w:tc>
@@ -3731,7 +3761,7 @@
               <w:keepNext/>
             </w:pPr>
             <w:r>
-              <w:t>Unidade da instituição que possui uma fila de chamados, como uma coordenação de curso ou a CAE</w:t>
+              <w:t>Unidade da instituição com uma fila própria de chamados, como uma coordenação de curso ou a CAE</w:t>
             </w:r>
           </w:p>
         </w:tc>
@@ -3764,7 +3794,7 @@
               <w:keepNext/>
             </w:pPr>
             <w:r>
-              <w:t>O único setor que recebe os chamados não cobertos por nenhuma regra de roteamento</w:t>
+              <w:t>O único setor que recebe os chamados que nenhuma regra de roteamento cobre</w:t>
             </w:r>
           </w:p>
         </w:tc>
@@ -3830,7 +3860,7 @@
               <w:keepNext/>
             </w:pPr>
             <w:r>
-              <w:t>Item da base de conhecimento usado pelo assistente para responder</w:t>
+              <w:t>Texto da base de conhecimento que o assistente usa para responder</w:t>
             </w:r>
           </w:p>
         </w:tc>
@@ -3863,7 +3893,10 @@
               <w:keepNext/>
             </w:pPr>
             <w:r>
-              <w:t>Pedido rastreável criado a partir de uma conversa não resolvida; para o aluno, aparece como solicitação</w:t>
+              <w:t xml:space="preserve">Pedido rastreável criado a partir de </w:t>
+            </w:r>
+            <w:r>
+              <w:t>uma conversa que não resolveu a dúvida; para o aluno, aparece como solicitação</w:t>
             </w:r>
           </w:p>
         </w:tc>
@@ -3896,7 +3929,7 @@
               <w:keepNext/>
             </w:pPr>
             <w:r>
-              <w:t>Mensagem do chamado visível ao aluno</w:t>
+              <w:t>Mensagem do chamado que o aluno vê</w:t>
             </w:r>
           </w:p>
         </w:tc>
@@ -3929,7 +3962,7 @@
               <w:keepNext/>
             </w:pPr>
             <w:r>
-              <w:t>Mensagem do chamado visível apenas a atendentes e administradores</w:t>
+              <w:t>Mensagem do chamado que só atendentes e administradores veem</w:t>
             </w:r>
           </w:p>
         </w:tc>
@@ -3981,6 +4014,7 @@
         <w:pStyle w:val="Legenda"/>
       </w:pPr>
       <w:r>
+        <w:lastRenderedPageBreak/>
         <w:t>Quadro 3 – Abreviações</w:t>
       </w:r>
     </w:p>
@@ -4153,7 +4187,10 @@
               <w:pStyle w:val="Tabela"/>
             </w:pPr>
             <w:r>
-              <w:t>Central de Atendimento ao Estudante</w:t>
+              <w:t xml:space="preserve">Central de Atendimento ao </w:t>
+            </w:r>
+            <w:r>
+              <w:t>Estudante</w:t>
             </w:r>
           </w:p>
         </w:tc>
@@ -4202,7 +4239,6 @@
               <w:pStyle w:val="Tabela"/>
             </w:pPr>
             <w:r>
-              <w:lastRenderedPageBreak/>
               <w:t>LGPD</w:t>
             </w:r>
           </w:p>
@@ -4278,10 +4314,7 @@
               <w:pStyle w:val="Tabela"/>
             </w:pPr>
             <w:r>
-              <w:t xml:space="preserve">Projeto </w:t>
-            </w:r>
-            <w:r>
-              <w:t>Extensionista Integrador</w:t>
+              <w:t>Projeto Extensionista Integrador</w:t>
             </w:r>
           </w:p>
         </w:tc>
@@ -4312,7 +4345,16 @@
               <w:pStyle w:val="Tabela"/>
             </w:pPr>
             <w:r>
-              <w:t>Aplicação web progressiva (progressive web app)</w:t>
+              <w:t xml:space="preserve">Aplicação web progressiva (do inglês </w:t>
+            </w:r>
+            <w:r>
+              <w:rPr>
+                <w:i/>
+              </w:rPr>
+              <w:t>progressive web app</w:t>
+            </w:r>
+            <w:r>
+              <w:t>)</w:t>
             </w:r>
           </w:p>
         </w:tc>
@@ -4343,7 +4385,10 @@
               <w:pStyle w:val="Tabela"/>
             </w:pPr>
             <w:r>
-              <w:t>Estilo de arquitetura para serviços web baseado em recursos e no protocolo HTTP</w:t>
+              <w:t xml:space="preserve">Estilo de arquitetura para </w:t>
+            </w:r>
+            <w:r>
+              <w:t>serviços web baseado em recursos e no protocolo HTTP</w:t>
             </w:r>
           </w:p>
         </w:tc>
@@ -4423,7 +4468,7 @@
               <w:pStyle w:val="Tabela"/>
             </w:pPr>
             <w:r>
-              <w:t>SPA</w:t>
+              <w:t>SLA</w:t>
             </w:r>
           </w:p>
         </w:tc>
@@ -4436,7 +4481,16 @@
               <w:pStyle w:val="Tabela"/>
             </w:pPr>
             <w:r>
-              <w:t>Aplicação de página única (single page application)</w:t>
+              <w:t xml:space="preserve">Acordo de nível de serviço (do inglês </w:t>
+            </w:r>
+            <w:r>
+              <w:rPr>
+                <w:i/>
+              </w:rPr>
+              <w:t>service level agreement</w:t>
+            </w:r>
+            <w:r>
+              <w:t>)</w:t>
             </w:r>
           </w:p>
         </w:tc>
@@ -4454,6 +4508,46 @@
               <w:pStyle w:val="Tabela"/>
             </w:pPr>
             <w:r>
+              <w:t>SPA</w:t>
+            </w:r>
+          </w:p>
+        </w:tc>
+        <w:tc>
+          <w:tcPr>
+            <w:tcW w:w="7749" w:type="dxa"/>
+          </w:tcPr>
+          <w:p>
+            <w:pPr>
+              <w:pStyle w:val="Tabela"/>
+            </w:pPr>
+            <w:r>
+              <w:t xml:space="preserve">Aplicação de página única (do inglês </w:t>
+            </w:r>
+            <w:r>
+              <w:rPr>
+                <w:i/>
+              </w:rPr>
+              <w:t>single page application</w:t>
+            </w:r>
+            <w:r>
+              <w:t>)</w:t>
+            </w:r>
+          </w:p>
+        </w:tc>
+      </w:tr>
+      <w:tr>
+        <w:trPr>
+          <w:jc w:val="center"/>
+        </w:trPr>
+        <w:tc>
+          <w:tcPr>
+            <w:tcW w:w="1321" w:type="dxa"/>
+          </w:tcPr>
+          <w:p>
+            <w:pPr>
+              <w:pStyle w:val="Tabela"/>
+            </w:pPr>
+            <w:r>
               <w:t>UC</w:t>
             </w:r>
           </w:p>
@@ -4467,7 +4561,10 @@
               <w:pStyle w:val="Tabela"/>
             </w:pPr>
             <w:r>
-              <w:t>Caso de uso</w:t>
+              <w:t xml:space="preserve">Caso de </w:t>
+            </w:r>
+            <w:r>
+              <w:t>uso</w:t>
             </w:r>
           </w:p>
         </w:tc>
@@ -4485,7 +4582,7 @@
       <w:pPr>
         <w:pStyle w:val="Heading2"/>
       </w:pPr>
-      <w:bookmarkStart w:id="5" w:name="_Toc241855255"/>
+      <w:bookmarkStart w:id="5" w:name="_Toc241857836"/>
       <w:r>
         <w:t>1.5 ESTRUTURA DO DOCUMENTO</w:t>
       </w:r>
@@ -4493,17 +4590,14 @@
     </w:p>
     <w:p>
       <w:r>
-        <w:t xml:space="preserve">A seção 2 descreve as técnicas de levantamento e o que elas revelaram. A seção 3 apresenta a visão geral do produto, seus usuários e as soluções </w:t>
-      </w:r>
-      <w:r>
-        <w:t>similares. A seção 4 especifica os requisitos funcionais e não funcionais. A seção 5 documenta as funcionalidades com o diagrama de casos de uso, as especificações dos casos de uso, o diagrama de classes e os modelos conceitual e lógico de dados. A seção 6 traz as considerações finais, as questões em aberto e os próximos passos.</w:t>
+        <w:t>Na seção 2 descrevemos como foi feito o levantamento e o que ele mostrou. A seção 3 apresenta o produto, os seus usuários e as soluções parecidas que já existem. A seção 4 traz os requisitos funcionais e não funcionais, e a seção 5 documenta as funcionalidades com o diagrama de casos de uso, as especificações de cada caso, o diagrama de classes e os modelos conceitual e lógico de dados. Por fim, a seção 6 reúne as considerações finais, as questões que continuam em aberto e os próximos passos.</w:t>
       </w:r>
     </w:p>
     <w:p>
       <w:pPr>
         <w:pStyle w:val="Heading1"/>
       </w:pPr>
-      <w:bookmarkStart w:id="6" w:name="_Toc241855256"/>
+      <w:bookmarkStart w:id="6" w:name="_Toc241857837"/>
       <w:r>
         <w:lastRenderedPageBreak/>
         <w:t>2 LEVANTAMENTO DE REQUISITOS</w:t>
@@ -4514,7 +4608,7 @@
       <w:pPr>
         <w:pStyle w:val="Heading2"/>
       </w:pPr>
-      <w:bookmarkStart w:id="7" w:name="_Toc241855257"/>
+      <w:bookmarkStart w:id="7" w:name="_Toc241857838"/>
       <w:r>
         <w:t>2.1 TÉCNICAS UTILIZADAS</w:t>
       </w:r>
@@ -4522,7 +4616,7 @@
     </w:p>
     <w:p>
       <w:r>
-        <w:t>O levantamento usou três técnicas, resumidas no Quadro 4. A principal foi a entrevista com a coordenadora dos cursos de tecnologia do Univag, realizada em duas sessões. O roteiro da segunda sessão perguntava sobre fatos passados, como a quantidade de mensagens recebidas na última semana, e não sobre intenções, para evitar respostas hipotéticas. Os números citados pela equipe antes da entrevista foram tratados como estimativa e substituídos pelos valores informados por ela.</w:t>
+        <w:t>Usamos três técnicas, resumidas no Quadro 4. A principal foi a entrevista com a coordenadora dos cursos de tecnologia do Univag, feita em duas sessões. Na segunda, o roteiro perguntava sobre fatos já acontecidos, como quantas mensagens ela tinha recebido na última semana, e evitava perguntas do tipo "você usaria...?", que levam a respostas hipotéticas. Os números que o grupo havia estimado antes da entrevista foram descartados e trocados pelos que ela informou.</w:t>
       </w:r>
     </w:p>
     <w:p>
@@ -4663,7 +4757,10 @@
               <w:keepNext/>
             </w:pPr>
             <w:r>
-              <w:t>Setembro de 2026 e 1º de outubro de 2026</w:t>
+              <w:t xml:space="preserve">Setembro de 2026 e 1º </w:t>
+            </w:r>
+            <w:r>
+              <w:t>de outubro de 2026</w:t>
             </w:r>
           </w:p>
         </w:tc>
@@ -4677,7 +4774,7 @@
               <w:keepNext/>
             </w:pPr>
             <w:r>
-              <w:t>Problema, linha de base de volume e tempo, lista de demandas e de quem as resolve</w:t>
+              <w:t>Descrição do problema, linha de base de volume e tempo, lista de demandas e de quem as resolve</w:t>
             </w:r>
           </w:p>
         </w:tc>
@@ -4738,10 +4835,7 @@
               <w:keepNext/>
             </w:pPr>
             <w:r>
-              <w:t xml:space="preserve">Soluções </w:t>
-            </w:r>
-            <w:r>
-              <w:t>similares, padrões de atendimento e modos de falha conhecidos</w:t>
+              <w:t>Soluções parecidas, padrões de atendimento e falhas já conhecidas</w:t>
             </w:r>
           </w:p>
         </w:tc>
@@ -4802,10 +4896,7 @@
               <w:keepNext/>
             </w:pPr>
             <w:r>
-              <w:t xml:space="preserve">Estrutura de entrega, restrições técnicas e a exigência de registro dos </w:t>
-            </w:r>
-            <w:r>
-              <w:t>atendimentos</w:t>
+              <w:t>Estrutura da entrega, restrições técnicas e a exigência de registro dos atendimentos</w:t>
             </w:r>
           </w:p>
         </w:tc>
@@ -4823,7 +4914,7 @@
       <w:pPr>
         <w:pStyle w:val="Heading2"/>
       </w:pPr>
-      <w:bookmarkStart w:id="8" w:name="_Toc241855258"/>
+      <w:bookmarkStart w:id="8" w:name="_Toc241857839"/>
       <w:r>
         <w:t>2.2 SITUAÇÃO ATUAL</w:t>
       </w:r>
@@ -4831,19 +4922,22 @@
     </w:p>
     <w:p>
       <w:r>
-        <w:t>A comunicação entre alunos e coordenação está dispersa em vários canais. O canal oficial, que era o WhatsApp, passou a ser o e-mail. Não existe registro das conversas e das respostas, e a coordenadora relatou que manter esse registro é uma exigência do MEC para a instituição; o instrumento de avaliação institucional pede canais de comunicação com a comunidade e que as manifestações gerem insumos para melhoria (BRASIL, 2017), mas o indicador exato e o prazo de retenção ainda precisam ser confirmados.</w:t>
+        <w:t xml:space="preserve">Hoje a comunicação entre os alunos e a coordenação está espalhada por vários canais. O canal oficial era o WhatsApp e passou a ser o e-mail. As conversas e as respostas não ficam registradas em lugar nenhum, e a coordenadora contou que manter esse registro é uma exigência do MEC para a instituição. O instrumento de avaliação institucional pede canais de comunicação com a comunidade e que as manifestações gerem melhorias (BRASIL, 2017), mas ainda falta confirmar qual indicador se aplica e por quanto tempo o </w:t>
+      </w:r>
+      <w:r>
+        <w:t>registro precisa ser guardado.</w:t>
       </w:r>
     </w:p>
     <w:p>
       <w:r>
-        <w:t>A coordenadora divide cerca de 40 horas semanais entre aulas, coordenação de cursos e gestão de professores, o que deixa pouco tempo para as demandas dos alunos. Os representantes de turma foram criados como um filtro, para que só os assuntos importantes cheguem a ela. As demandas mais citadas na primeira sessão, o boleto do semestre e o atestado de escolaridade, já podem ser resolvidas pelo próprio aluno no Portal do Aluno; o problema, portanto, não é a falta do serviço, mas saber onde ele está.</w:t>
+        <w:t>A coordenadora divide cerca de 40 horas semanais entre aulas, coordenação dos cursos e gestão dos professores, e sobra pouco tempo para as demandas dos alunos. Os representantes de turma foram criados justamente como um filtro, para que só os assuntos importantes cheguem até ela. As demandas mais citadas na primeira sessão foram o boleto do semestre e o atestado de escolaridade, e as duas o próprio aluno já consegue resolver no Portal do Aluno. O serviço existe; o aluno é que não sabe onde encontrá-lo.</w:t>
       </w:r>
     </w:p>
     <w:p>
       <w:pPr>
         <w:pStyle w:val="Heading2"/>
       </w:pPr>
-      <w:bookmarkStart w:id="9" w:name="_Toc241855259"/>
+      <w:bookmarkStart w:id="9" w:name="_Toc241857840"/>
       <w:r>
         <w:lastRenderedPageBreak/>
         <w:t>2.3 VOLUME E TEMPO DE ATENDIMENTO</w:t>
@@ -4852,7 +4946,7 @@
     </w:p>
     <w:p>
       <w:r>
-        <w:t>O Quadro 5 reúne a linha de base informada pela coordenadora na segunda sessão. A unidade de contagem é a mensagem, e não a demanda, porque um mesmo pedido pode ocupar várias mensagens.</w:t>
+        <w:t>O Quadro 5 reúne a linha de base que a coordenadora informou na segunda sessão. Contamos mensagens, e não demandas, porque um mesmo pedido pode ocupar várias mensagens.</w:t>
       </w:r>
     </w:p>
     <w:p>
@@ -4975,10 +5069,7 @@
               <w:keepNext/>
             </w:pPr>
             <w:r>
-              <w:t xml:space="preserve">Contagem aproximada; o </w:t>
-            </w:r>
-            <w:r>
-              <w:t>WhatsApp concentra cerca de 67%</w:t>
+              <w:t>Contagem aproximada; o WhatsApp concentra cerca de 67%</w:t>
             </w:r>
           </w:p>
         </w:tc>
@@ -5119,7 +5210,7 @@
               <w:keepNext/>
             </w:pPr>
             <w:r>
-              <w:t>Uma demanda é atendida do início ao fim enquanto as outras esperam</w:t>
+              <w:t>Ela atende uma demanda do começo ao fim, e as outras esperam</w:t>
             </w:r>
           </w:p>
         </w:tc>
@@ -5166,10 +5257,7 @@
               <w:keepNext/>
             </w:pPr>
             <w:r>
-              <w:t xml:space="preserve">Período não informado (a </w:t>
-            </w:r>
-            <w:r>
-              <w:t>confirmar)</w:t>
+              <w:t>Período não informado (a confirmar)</w:t>
             </w:r>
           </w:p>
         </w:tc>
@@ -5180,24 +5268,27 @@
         <w:pStyle w:val="Fonte"/>
       </w:pPr>
       <w:r>
-        <w:t>Fonte: elaborado pelos autores com base na entrevista com a coordenação (2026).</w:t>
+        <w:t xml:space="preserve">Fonte: elaborado pelos autores com base </w:t>
+      </w:r>
+      <w:r>
+        <w:t>na entrevista com a coordenação (2026).</w:t>
       </w:r>
     </w:p>
     <w:p>
       <w:r>
-        <w:t>Os valores de tempo ainda não fecham entre si. Se as 5 h e as 3 h forem semanais, não cobrem cerca de 128 mensagens de demandas reais atendidas em pelo menos 10 min cada, o que daria cerca de 21 horas; se forem diárias, somam 40 horas por semana, o que coincide com a jornada relatada. Por isso a unidade está marcada como a confirmar. A coordenadora também não informou quanto tempo o aluno espera pela primeira resposta, apenas quanto dura cada atendimento.</w:t>
+        <w:t>Os valores de tempo ainda não batem entre si. Se as 5 h e as 3 h forem por semana, não dão conta de cerca de 128 mensagens de demandas reais atendidas em pelo menos 10 min cada, o que exigiria umas 21 horas. Se forem por dia, somam 40 horas na semana, que é exatamente a jornada que ela relatou. Por isso a unidade ficou marcada como a confirmar. Ela também não disse quanto tempo o aluno espera pela primeira resposta, só quanto dura cada atendimento.</w:t>
       </w:r>
     </w:p>
     <w:p>
       <w:r>
-        <w:t>Segundo a coordenadora, o que mais consome tempo é localizar os dados do aluno, como curso e semestre, o que atrasa até perguntas simples como "qual é o meu e-mail institucional".</w:t>
+        <w:t>Segundo a coordenadora, o que mais toma tempo é encontrar os dados do aluno, como curso e semestre. Isso atrasa até perguntas simples, como "qual é o meu e-mail institucional".</w:t>
       </w:r>
     </w:p>
     <w:p>
       <w:pPr>
         <w:pStyle w:val="Heading2"/>
       </w:pPr>
-      <w:bookmarkStart w:id="10" w:name="_Toc241855260"/>
+      <w:bookmarkStart w:id="10" w:name="_Toc241857841"/>
       <w:r>
         <w:t>2.4 DEMANDAS MAIS FREQUENTES</w:t>
       </w:r>
@@ -5205,7 +5296,7 @@
     </w:p>
     <w:p>
       <w:r>
-        <w:t>O Quadro 6 lista as demandas citadas pela coordenadora e quem as resolve hoje. A lista não é exaustiva, e o volume de cada tipo ainda não foi informado.</w:t>
+        <w:t>O Quadro 6 mostra as demandas que a coordenadora citou e quem resolve cada uma hoje. A lista não está completa, e ela ainda não informou o volume de cada tipo.</w:t>
       </w:r>
     </w:p>
     <w:p>
@@ -5309,7 +5400,7 @@
               <w:pStyle w:val="Tabela"/>
             </w:pPr>
             <w:r>
-              <w:t>Todo o semestre</w:t>
+              <w:t>O semestre todo</w:t>
             </w:r>
           </w:p>
         </w:tc>
@@ -5322,7 +5413,10 @@
               <w:pStyle w:val="Tabela"/>
             </w:pPr>
             <w:r>
-              <w:t>O próprio aluno, no Portal do Aluno</w:t>
+              <w:t>O</w:t>
+            </w:r>
+            <w:r>
+              <w:t xml:space="preserve"> próprio aluno, no Portal do Aluno</w:t>
             </w:r>
           </w:p>
         </w:tc>
@@ -5353,7 +5447,7 @@
               <w:pStyle w:val="Tabela"/>
             </w:pPr>
             <w:r>
-              <w:t>Todo o semestre</w:t>
+              <w:t>O semestre todo</w:t>
             </w:r>
           </w:p>
         </w:tc>
@@ -5384,7 +5478,7 @@
               <w:pStyle w:val="Tabela"/>
             </w:pPr>
             <w:r>
-              <w:t>Plano de estudos não aceito; aluno decide não cursar uma disciplina</w:t>
+              <w:t>Plano de estudos não aceito; aluno que decide não cursar uma disciplina</w:t>
             </w:r>
           </w:p>
         </w:tc>
@@ -5485,7 +5579,7 @@
               <w:pStyle w:val="Tabela"/>
             </w:pPr>
             <w:r>
-              <w:t>Todo o semestre</w:t>
+              <w:t>O semestre todo</w:t>
             </w:r>
           </w:p>
         </w:tc>
@@ -5529,7 +5623,7 @@
               <w:pStyle w:val="Tabela"/>
             </w:pPr>
             <w:r>
-              <w:t>Todo o semestre</w:t>
+              <w:t>O semestre todo</w:t>
             </w:r>
           </w:p>
         </w:tc>
@@ -5542,14 +5636,7 @@
               <w:pStyle w:val="Tabela"/>
             </w:pPr>
             <w:r>
-              <w:t xml:space="preserve">Ninguém: pelo Estatuto do Aluno, </w:t>
-            </w:r>
-            <w:r>
-              <w:lastRenderedPageBreak/>
-              <w:t xml:space="preserve">nenhuma justificativa ou </w:t>
-            </w:r>
-            <w:r>
-              <w:t>atestado abona falta</w:t>
+              <w:t>Ninguém: pelo Estatuto do Aluno, nenhuma justificativa ou atestado abona falta</w:t>
             </w:r>
           </w:p>
         </w:tc>
@@ -5581,7 +5668,10 @@
               <w:pStyle w:val="Tabela"/>
             </w:pPr>
             <w:r>
-              <w:t>Todo o semestre</w:t>
+              <w:t xml:space="preserve">O </w:t>
+            </w:r>
+            <w:r>
+              <w:t>semestre todo</w:t>
             </w:r>
           </w:p>
         </w:tc>
@@ -5612,7 +5702,7 @@
               <w:pStyle w:val="Tabela"/>
             </w:pPr>
             <w:r>
-              <w:t>Demanda direta para um professor que chega pela coordenação</w:t>
+              <w:t>Demanda para um professor que chega pela coordenação</w:t>
             </w:r>
           </w:p>
         </w:tc>
@@ -5625,7 +5715,7 @@
               <w:pStyle w:val="Tabela"/>
             </w:pPr>
             <w:r>
-              <w:t>Todo o semestre</w:t>
+              <w:t>O semestre todo</w:t>
             </w:r>
           </w:p>
         </w:tc>
@@ -5669,7 +5759,7 @@
               <w:pStyle w:val="Tabela"/>
             </w:pPr>
             <w:r>
-              <w:t>Todo o semestre</w:t>
+              <w:t>O semestre todo</w:t>
             </w:r>
           </w:p>
         </w:tc>
@@ -5700,10 +5790,7 @@
               <w:pStyle w:val="Tabela"/>
             </w:pPr>
             <w:r>
-              <w:t xml:space="preserve">Nota </w:t>
-            </w:r>
-            <w:r>
-              <w:t>lançada errada</w:t>
+              <w:t>Nota lançada errada</w:t>
             </w:r>
           </w:p>
         </w:tc>
@@ -5716,7 +5803,7 @@
               <w:pStyle w:val="Tabela"/>
             </w:pPr>
             <w:r>
-              <w:t>Todo o semestre</w:t>
+              <w:t>O semestre todo</w:t>
             </w:r>
           </w:p>
         </w:tc>
@@ -5760,7 +5847,7 @@
               <w:pStyle w:val="Tabela"/>
             </w:pPr>
             <w:r>
-              <w:t>Todo o semestre</w:t>
+              <w:t>O semestre todo</w:t>
             </w:r>
           </w:p>
         </w:tc>
@@ -5773,7 +5860,7 @@
               <w:pStyle w:val="Tabela"/>
             </w:pPr>
             <w:r>
-              <w:t>Depende do horário de aula; quem responde não foi informado</w:t>
+              <w:t>Depende do horário de aula; não foi informado quem responde</w:t>
             </w:r>
           </w:p>
         </w:tc>
@@ -5804,7 +5891,7 @@
               <w:pStyle w:val="Tabela"/>
             </w:pPr>
             <w:r>
-              <w:t>Todo o semestre</w:t>
+              <w:t>O semestre todo</w:t>
             </w:r>
           </w:p>
         </w:tc>
@@ -5835,15 +5922,18 @@
       <w:pPr>
         <w:pStyle w:val="Heading2"/>
       </w:pPr>
-      <w:bookmarkStart w:id="11" w:name="_Toc241855261"/>
+      <w:bookmarkStart w:id="11" w:name="_Toc241857842"/>
       <w:r>
-        <w:t>2.5 IMPLICAÇÕES PARA OS REQUISITOS</w:t>
+        <w:t xml:space="preserve">2.5 IMPLICAÇÕES PARA OS </w:t>
+      </w:r>
+      <w:r>
+        <w:t>REQUISITOS</w:t>
       </w:r>
       <w:bookmarkEnd w:id="11"/>
     </w:p>
     <w:p>
       <w:r>
-        <w:t>O levantamento leva a cinco conclusões que orientam os requisitos das seções 4 e 5:</w:t>
+        <w:t>Do levantamento tiramos cinco conclusões, que orientam os requisitos das seções 4 e 5:</w:t>
       </w:r>
     </w:p>
     <w:p>
@@ -5851,10 +5941,7 @@
         <w:pStyle w:val="ListBullet"/>
       </w:pPr>
       <w:r>
-        <w:t xml:space="preserve">as demandas chegam de fato à coordenação, em volume muito maior do que a estimativa inicial da </w:t>
-      </w:r>
-      <w:r>
-        <w:t>equipe, de cerca de 60 por semana; a coordenação continua sendo o público principal;</w:t>
+        <w:t>as demandas chegam mesmo à coordenação, e em volume bem maior do que a nossa estimativa inicial, de cerca de 60 por semana; por isso a coordenação continua sendo o público principal;</w:t>
       </w:r>
     </w:p>
     <w:p>
@@ -5862,7 +5949,7 @@
         <w:pStyle w:val="ListBullet"/>
       </w:pPr>
       <w:r>
-        <w:t>o WhatsApp concentra a maior parte das mensagens e fica fora do produto mínimo viável; a comparação do piloto precisa contar também as mensagens do WhatsApp, ou uma queda nos e-mails pode esconder apenas uma troca de canal;</w:t>
+        <w:t>a maior parte das mensagens vem pelo WhatsApp, que fica fora do produto mínimo viável; no piloto, a comparação precisa contar também essas mensagens, senão uma queda nos e-mails pode significar apenas que os alunos trocaram de canal;</w:t>
       </w:r>
     </w:p>
     <w:p>
@@ -5870,7 +5957,7 @@
         <w:pStyle w:val="ListBullet"/>
       </w:pPr>
       <w:r>
-        <w:t>localizar os dados do aluno consome tempo, por isso o chamado já chega com o curso e o semestre do aluno (RF-16 e premissa Q19);</w:t>
+        <w:t>procurar os dados do aluno toma tempo, então o chamado já chega com o curso e o semestre do aluno (RF-16 e premissa Q19);</w:t>
       </w:r>
     </w:p>
     <w:p>
@@ -5878,7 +5965,7 @@
         <w:pStyle w:val="ListBullet"/>
       </w:pPr>
       <w:r>
-        <w:t>várias demandas são resolvidas pelo professor, destino que o roteamento por setor não alcança; a premissa Q18 trata esse caso com um artigo que orienta o aluno;</w:t>
+        <w:t>várias demandas são resolvidas pelo professor, e o roteamento por setor não chega até ele; a premissa Q18 trata esse caso com um artigo que orienta o aluno a procurá-lo;</w:t>
       </w:r>
     </w:p>
     <w:p>
@@ -5886,14 +5973,14 @@
         <w:pStyle w:val="ListBullet"/>
       </w:pPr>
       <w:r>
-        <w:t>algumas demandas têm uma resposta fixa, como faltas, boleto e atestado, e são as primeiras candidatas a artigo da base de conhecimento.</w:t>
+        <w:t>algumas demandas têm sempre a mesma resposta, como faltas, boleto e atestado, e vão ser os primeiros artigos da base de conhecimento.</w:t>
       </w:r>
     </w:p>
     <w:p>
       <w:pPr>
         <w:pStyle w:val="Heading1"/>
       </w:pPr>
-      <w:bookmarkStart w:id="12" w:name="_Toc241855262"/>
+      <w:bookmarkStart w:id="12" w:name="_Toc241857843"/>
       <w:r>
         <w:lastRenderedPageBreak/>
         <w:t>3 VISÃO GERAL DO PRODUTO</w:t>
@@ -5904,7 +5991,7 @@
       <w:pPr>
         <w:pStyle w:val="Heading2"/>
       </w:pPr>
-      <w:bookmarkStart w:id="13" w:name="_Toc241855263"/>
+      <w:bookmarkStart w:id="13" w:name="_Toc241857844"/>
       <w:r>
         <w:t>3.1 DESCRIÇÃO DO PRODUTO</w:t>
       </w:r>
@@ -5912,22 +5999,22 @@
     </w:p>
     <w:p>
       <w:r>
-        <w:t>O One é uma aplicação web progressiva, instalável no celular e no computador, que reúne três componentes: um assistente que entende perguntas em linguagem natural, uma base de conhecimento mantida pela instituição e um módulo de chamados com atendimento humano.</w:t>
+        <w:t>O One é uma aplicação web progressiva, que pode ser instalada no celular e no computador. Ele tem três partes: um assistente que entende perguntas escritas em linguagem natural, uma base de conhecimento mantida pela instituição e um módulo de chamados com atendimento humano.</w:t>
       </w:r>
     </w:p>
     <w:p>
       <w:r>
-        <w:t>O assistente só responde com base nos artigos publicados na base de conhecimento. Quando encontra um artigo, mostra a resposta e pergunta se ela resolveu a dúvida. Quando o aluno responde que não, ou quando nenhum artigo corresponde à pergunta, o sistema oferece transformar a conversa em um chamado. O chamado recebe automaticamente a transcrição da conversa, o curso do aluno, uma categoria e o setor responsável, de modo que o atendente não precisa pedir que o aluno repita a história. A partir daí, o chamado</w:t>
+        <w:t xml:space="preserve">O assistente só responde com base nos artigos publicados na base de conhecimento. Quando encontra um artigo, mostra a resposta e pergunta ao aluno se ela resolveu. Se o aluno disser que não, ou se nenhum artigo tiver relação com a pergunta, o sistema oferece transformar a conversa em um chamado. O chamado já é criado com a transcrição da conversa, o curso do aluno, uma categoria e o setor responsável, e assim o atendente não precisa pedir que o aluno repita tudo. A partir daí, cada passo do chamado fica no </w:t>
       </w:r>
       <w:r>
-        <w:t xml:space="preserve"> percorre um ciclo de vida registrado, e cada ação fica no histórico com autor, data e hora.</w:t>
+        <w:t>histórico com autor, data e hora.</w:t>
       </w:r>
     </w:p>
     <w:p>
       <w:pPr>
         <w:pStyle w:val="Heading2"/>
       </w:pPr>
-      <w:bookmarkStart w:id="14" w:name="_Toc241855264"/>
+      <w:bookmarkStart w:id="14" w:name="_Toc241857845"/>
       <w:r>
         <w:t>3.2 USUÁRIOS DA SOLUÇÃO</w:t>
       </w:r>
@@ -5935,7 +6022,7 @@
     </w:p>
     <w:p>
       <w:r>
-        <w:t>O Quadro 7 descreve os três perfis de usuário. Um mesmo usuário pode ter mais de um perfil.</w:t>
+        <w:t>O Quadro 7 descreve os três perfis de usuário. Uma mesma pessoa pode ter mais de um perfil.</w:t>
       </w:r>
     </w:p>
     <w:p>
@@ -6044,7 +6131,10 @@
               <w:keepNext/>
             </w:pPr>
             <w:r>
-              <w:t>Estudante matriculado em um curso da instituição</w:t>
+              <w:t xml:space="preserve">Estudante matriculado em um curso da </w:t>
+            </w:r>
+            <w:r>
+              <w:t>instituição</w:t>
             </w:r>
           </w:p>
         </w:tc>
@@ -6091,10 +6181,7 @@
               <w:keepNext/>
             </w:pPr>
             <w:r>
-              <w:t xml:space="preserve">Funcionário de um setor, como a coordenação de </w:t>
-            </w:r>
-            <w:r>
-              <w:t>curso ou a CAE</w:t>
+              <w:t>Funcionário de um setor, como a coordenação de curso ou a CAE</w:t>
             </w:r>
           </w:p>
         </w:tc>
@@ -6108,7 +6195,10 @@
               <w:keepNext/>
             </w:pPr>
             <w:r>
-              <w:t>Vê a fila dos seus setores, assume, responde, encaminha, reclassifica e resolve chamados</w:t>
+              <w:t xml:space="preserve">Vê a fila dos seus setores, assume, responde, encaminha, </w:t>
+            </w:r>
+            <w:r>
+              <w:t>reclassifica e resolve chamados</w:t>
             </w:r>
           </w:p>
         </w:tc>
@@ -6155,10 +6245,7 @@
               <w:keepNext/>
             </w:pPr>
             <w:r>
-              <w:t xml:space="preserve">Gerencia usuários, setores, categorias, regras de roteamento e base de </w:t>
-            </w:r>
-            <w:r>
-              <w:t>conhecimento; consulta os indicadores</w:t>
+              <w:t>Cuida de usuários, setores, categorias, regras de roteamento e base de conhecimento, e consulta os indicadores</w:t>
             </w:r>
           </w:p>
         </w:tc>
@@ -6176,7 +6263,7 @@
       <w:pPr>
         <w:pStyle w:val="Heading2"/>
       </w:pPr>
-      <w:bookmarkStart w:id="15" w:name="_Toc241855265"/>
+      <w:bookmarkStart w:id="15" w:name="_Toc241857846"/>
       <w:r>
         <w:t>3.3 ABRANGÊNCIA E SOLUÇÕES SIMILARES</w:t>
       </w:r>
@@ -6184,7 +6271,7 @@
     </w:p>
     <w:p>
       <w:r>
-        <w:t>A pesquisa de mercado mostrou que o padrão das plataformas líderes é o mesmo proposto para o One: base de conhecimento, assistente na frente, passagem para um humano com o contexto preservado e encaminhamento ao setor especialista. O Quadro 8 compara as soluções mais próximas.</w:t>
+        <w:t>Na pesquisa de mercado vimos que as plataformas mais usadas seguem o mesmo caminho que propomos para o One: uma base de conhecimento, um assistente que atende primeiro, a passagem para uma pessoa sem perder o contexto e o encaminhamento ao setor especialista. O Quadro 8 compara as soluções mais próximas.</w:t>
       </w:r>
     </w:p>
     <w:p>
@@ -6312,10 +6399,7 @@
               <w:keepNext/>
             </w:pPr>
             <w:r>
-              <w:t xml:space="preserve">Assistente para </w:t>
-            </w:r>
-            <w:r>
-              <w:t>ensino superior</w:t>
+              <w:t>Assistente para ensino superior</w:t>
             </w:r>
           </w:p>
         </w:tc>
@@ -6329,7 +6413,13 @@
               <w:keepNext/>
             </w:pPr>
             <w:r>
-              <w:t>Chatbot proativo por SMS, com base de conhecimento e passagem ao humano</w:t>
+              <w:rPr>
+                <w:i/>
+              </w:rPr>
+              <w:t>Chatbot</w:t>
+            </w:r>
+            <w:r>
+              <w:t xml:space="preserve"> proativo por SMS, com base de conhecimento e passagem ao humano</w:t>
             </w:r>
           </w:p>
         </w:tc>
@@ -6343,7 +6433,7 @@
               <w:keepNext/>
             </w:pPr>
             <w:r>
-              <w:t>Focado em instituições dos Estados Unidos e em matrícula; não faz roteamento acadêmico por curso</w:t>
+              <w:t>Voltado a instituições dos Estados Unidos e à matrícula; não faz roteamento acadêmico por curso</w:t>
             </w:r>
           </w:p>
         </w:tc>
@@ -6390,7 +6480,22 @@
               <w:keepNext/>
             </w:pPr>
             <w:r>
-              <w:t>Bot treinado no conteúdo da instituição, um por departamento, com chat ao vivo</w:t>
+              <w:rPr>
+                <w:i/>
+              </w:rPr>
+              <w:t>Bot</w:t>
+            </w:r>
+            <w:r>
+              <w:t xml:space="preserve"> treinado no conteúdo da instituição, um por departamento, com </w:t>
+            </w:r>
+            <w:r>
+              <w:rPr>
+                <w:i/>
+              </w:rPr>
+              <w:t>chat</w:t>
+            </w:r>
+            <w:r>
+              <w:t xml:space="preserve"> ao vivo</w:t>
             </w:r>
           </w:p>
         </w:tc>
@@ -6404,7 +6509,7 @@
               <w:keepNext/>
             </w:pPr>
             <w:r>
-              <w:t>Contratação por porte da instituição; sem fila de chamados por curso</w:t>
+              <w:t>Contratado conforme o porte da instituição; não tem fila de chamados por curso</w:t>
             </w:r>
           </w:p>
         </w:tc>
@@ -6451,7 +6556,7 @@
               <w:keepNext/>
             </w:pPr>
             <w:r>
-              <w:t>Portal, catálogo, base de conhecimento e fluxos para setores</w:t>
+              <w:t>Portal, catálogo, base de conhecimento e fluxos para os setores</w:t>
             </w:r>
           </w:p>
         </w:tc>
@@ -6465,7 +6570,7 @@
               <w:keepNext/>
             </w:pPr>
             <w:r>
-              <w:t>Exige configuração de fluxos; não tem assistente restrito à base como entrada principal</w:t>
+              <w:t>Exige configurar fluxos; a entrada principal não é um assistente restrito à base</w:t>
             </w:r>
           </w:p>
         </w:tc>
@@ -6498,7 +6603,13 @@
               <w:keepNext/>
             </w:pPr>
             <w:r>
-              <w:t>Helpdesk geral</w:t>
+              <w:rPr>
+                <w:i/>
+              </w:rPr>
+              <w:t>Helpdesk</w:t>
+            </w:r>
+            <w:r>
+              <w:t xml:space="preserve"> geral</w:t>
             </w:r>
           </w:p>
         </w:tc>
@@ -6559,10 +6670,13 @@
               <w:keepNext/>
             </w:pPr>
             <w:r>
-              <w:t xml:space="preserve">Helpdesk de código </w:t>
-            </w:r>
-            <w:r>
-              <w:t>aberto</w:t>
+              <w:rPr>
+                <w:i/>
+              </w:rPr>
+              <w:t>Helpdesk</w:t>
+            </w:r>
+            <w:r>
+              <w:t xml:space="preserve"> de código aberto</w:t>
             </w:r>
           </w:p>
         </w:tc>
@@ -6576,7 +6690,10 @@
               <w:keepNext/>
             </w:pPr>
             <w:r>
-              <w:t>Chamados com categorização, atribuição e SLA</w:t>
+              <w:t xml:space="preserve">Chamados com </w:t>
+            </w:r>
+            <w:r>
+              <w:t>categorização, atribuição e SLA</w:t>
             </w:r>
           </w:p>
         </w:tc>
@@ -6590,7 +6707,7 @@
               <w:keepNext/>
             </w:pPr>
             <w:r>
-              <w:t>Sem IA generativa nativa; o chamado vem antes da tentativa de resolver</w:t>
+              <w:t>Não tem IA generativa nativa; o chamado é aberto antes de qualquer tentativa de resolver</w:t>
             </w:r>
           </w:p>
         </w:tc>
@@ -6637,7 +6754,13 @@
               <w:keepNext/>
             </w:pPr>
             <w:r>
-              <w:t>Atendimento pelo WhatsApp com bots</w:t>
+              <w:t xml:space="preserve">Atendimento pelo WhatsApp com </w:t>
+            </w:r>
+            <w:r>
+              <w:rPr>
+                <w:i/>
+              </w:rPr>
+              <w:t>bots</w:t>
             </w:r>
           </w:p>
         </w:tc>
@@ -6712,7 +6835,7 @@
               <w:keepNext/>
             </w:pPr>
             <w:r>
-              <w:t>Protocolo formal, sem conversa nem tentativa de resolver antes de abrir o pedido</w:t>
+              <w:t>Protocolo formal, sem conversa e sem tentar resolver antes de abrir o pedido</w:t>
             </w:r>
           </w:p>
         </w:tc>
@@ -6728,25 +6851,25 @@
     </w:p>
     <w:p>
       <w:r>
-        <w:t>A pesquisa também ajustou a expectativa sobre o autoatendimento. Fornecedores anunciam de 65% a 98% de resolução pelo assistente, mas uma pesquisa independente com clientes indica que apenas 14% das questões são totalmente resolvidas por autoatendimento (GARTNER, 2024). Por isso o One mede a resolução pelo autoatendimento de forma explícita, pela resposta "Sim" do aluno, e sempre oferece a passagem para um atendente.</w:t>
+        <w:t>A pesquisa também mudou a nossa expectativa sobre o autoatendimento. Os fornecedores anunciam que o assistente resolve de 65% a 98% dos casos, mas uma pesquisa independente com clientes aponta que só 14% das questões são resolvidas por completo no autoatendimento (GARTNER, 2024). Por isso, no One, a resolução pelo autoatendimento só conta quando o aluno responde "Sim", e, quando a resposta não resolve, o sistema sempre oferece abrir um chamado.</w:t>
       </w:r>
     </w:p>
     <w:p>
       <w:pPr>
         <w:pStyle w:val="Heading2"/>
       </w:pPr>
-      <w:bookmarkStart w:id="16" w:name="_Toc241855266"/>
+      <w:bookmarkStart w:id="16" w:name="_Toc241857847"/>
       <w:r>
-        <w:t>3.4 SUPOSIÇÕES E DEPENDÊNCIAS</w:t>
+        <w:t xml:space="preserve">3.4 SUPOSIÇÕES E </w:t>
+      </w:r>
+      <w:r>
+        <w:t>DEPENDÊNCIAS</w:t>
       </w:r>
       <w:bookmarkEnd w:id="16"/>
     </w:p>
     <w:p>
       <w:r>
-        <w:t xml:space="preserve">O </w:t>
-      </w:r>
-      <w:r>
-        <w:t>funcionamento do One depende das seguintes condições:</w:t>
+        <w:t>Para funcionar, o One depende de algumas condições:</w:t>
       </w:r>
     </w:p>
     <w:p>
@@ -6754,7 +6877,7 @@
         <w:pStyle w:val="ListBullet"/>
       </w:pPr>
       <w:r>
-        <w:t>o Portal do Aluno continua oferecendo boleto, atestado e os demais serviços para os quais os artigos apontam;</w:t>
+        <w:t>o Portal do Aluno continua oferecendo boleto, atestado e os outros serviços para os quais os artigos apontam;</w:t>
       </w:r>
     </w:p>
     <w:p>
@@ -6762,7 +6885,10 @@
         <w:pStyle w:val="ListBullet"/>
       </w:pPr>
       <w:r>
-        <w:t>um provedor externo de IA está disponível para interpretar as perguntas, e a instituição aceita esse uso com aviso ao aluno (premissa Q13);</w:t>
+        <w:t xml:space="preserve">há um provedor externo de IA disponível para interpretar as perguntas, e a </w:t>
+      </w:r>
+      <w:r>
+        <w:t>instituição aceita esse uso com aviso ao aluno (premissa Q13);</w:t>
       </w:r>
     </w:p>
     <w:p>
@@ -6770,7 +6896,7 @@
         <w:pStyle w:val="ListBullet"/>
       </w:pPr>
       <w:r>
-        <w:t>um serviço de envio de e-mail está disponível para notificar os alunos;</w:t>
+        <w:t>há um serviço de envio de e-mail para notificar os alunos;</w:t>
       </w:r>
     </w:p>
     <w:p>
@@ -6779,7 +6905,7 @@
       </w:pPr>
       <w:r>
         <w:lastRenderedPageBreak/>
-        <w:t>o administrador recebe da instituição a lista de alunos, com curso e semestre, para criar as contas (premissas Q5 e Q19);</w:t>
+        <w:t>a instituição entrega ao administrador a lista de alunos, com curso e semestre, para a criação das contas (premissas Q5 e Q19);</w:t>
       </w:r>
     </w:p>
     <w:p>
@@ -6787,7 +6913,7 @@
         <w:pStyle w:val="ListBullet"/>
       </w:pPr>
       <w:r>
-        <w:t>a coordenação indica os setores participantes do piloto, seus atendentes e o conteúdo dos primeiros artigos;</w:t>
+        <w:t>a coordenação indica os setores que participam do piloto, os atendentes de cada um e o conteúdo dos primeiros artigos;</w:t>
       </w:r>
     </w:p>
     <w:p>
@@ -6802,7 +6928,7 @@
       <w:pPr>
         <w:pStyle w:val="Heading1"/>
       </w:pPr>
-      <w:bookmarkStart w:id="17" w:name="_Toc241855267"/>
+      <w:bookmarkStart w:id="17" w:name="_Toc241857848"/>
       <w:r>
         <w:lastRenderedPageBreak/>
         <w:t>4 REQUISITOS DO PRODUTO</w:t>
@@ -6813,7 +6939,7 @@
       <w:pPr>
         <w:pStyle w:val="Heading2"/>
       </w:pPr>
-      <w:bookmarkStart w:id="18" w:name="_Toc241855268"/>
+      <w:bookmarkStart w:id="18" w:name="_Toc241857849"/>
       <w:r>
         <w:t>4.1 REQUISITOS FUNCIONAIS</w:t>
       </w:r>
@@ -6821,10 +6947,7 @@
     </w:p>
     <w:p>
       <w:r>
-        <w:t xml:space="preserve">O Quadro 9 lista os </w:t>
-      </w:r>
-      <w:r>
-        <w:t>requisitos funcionais do produto mínimo viável. A coluna Origem indica as regras da especificação de negócio do projeto de que cada requisito deriva; todas as regras e transições da especificação aparecem em pelo menos um requisito. As transições de estado do chamado estão detalhadas no Quadro 10.</w:t>
+        <w:t>O Quadro 9 lista os requisitos funcionais do produto mínimo viável. A coluna Origem mostra de quais regras da especificação de negócio cada requisito vem, e todas as regras e transições da especificação aparecem em pelo menos um requisito. As transições de estado do chamado estão detalhadas no Quadro 10.</w:t>
       </w:r>
     </w:p>
     <w:p>
@@ -6928,7 +7051,7 @@
               <w:pStyle w:val="Tabela"/>
             </w:pPr>
             <w:r>
-              <w:t>O sistema deve permitir acesso apenas a contas criadas pelo administrador, individualmente ou por importação em lote, sem autocadastro.</w:t>
+              <w:t>O sistema deve permitir o acesso apenas de contas criadas pelo administrador, uma a uma ou por importação em lote, sem autocadastro.</w:t>
             </w:r>
           </w:p>
         </w:tc>
@@ -6975,7 +7098,7 @@
               <w:t xml:space="preserve">O </w:t>
             </w:r>
             <w:r>
-              <w:t>sistema deve atribuir a cada usuário um ou mais perfis entre aluno, atendente e administrador; o aluno deve ter ao menos um curso, com semestre, e o atendente ao menos um setor.</w:t>
+              <w:t>sistema deve atribuir a cada usuário um ou mais perfis entre aluno, atendente e administrador; o aluno deve ter ao menos um curso, com o semestre, e o atendente, ao menos um setor.</w:t>
             </w:r>
           </w:p>
         </w:tc>
@@ -7019,7 +7142,7 @@
               <w:pStyle w:val="Tabela"/>
             </w:pPr>
             <w:r>
-              <w:t>O sistema deve mostrar ao aluno apenas as suas conversas e chamados, ao atendente apenas os chamados que estão nos seus setores, perdendo o acesso quando o chamado é encaminhado para fora deles, e ao administrador todos os chamados, conversas e o painel.</w:t>
+              <w:t>O sistema deve mostrar ao aluno apenas as suas conversas e os seus chamados; ao atendente, apenas os chamados que estão nos seus setores, sem acesso depois que o chamado é encaminhado para fora deles; e ao administrador, todos os chamados, todas as conversas e o painel.</w:t>
             </w:r>
           </w:p>
         </w:tc>
@@ -7063,7 +7186,7 @@
               <w:pStyle w:val="Tabela"/>
             </w:pPr>
             <w:r>
-              <w:t>O sistema deve impedir o acesso de usuário desativado, mantendo o seu histórico intacto e atribuído a ele.</w:t>
+              <w:t>O sistema deve impedir o acesso de usuário desativado e manter o histórico dele intacto e atribuído a ele.</w:t>
             </w:r>
           </w:p>
         </w:tc>
@@ -7239,7 +7362,7 @@
               <w:pStyle w:val="Tabela"/>
             </w:pPr>
             <w:r>
-              <w:t>Quando não houver artigo correspondente, o assistente deve informar que não encontrou resposta e oferecer a abertura de chamado, sem mostrar artigo não relacionado.</w:t>
+              <w:t>Quando não houver artigo correspondente, o assistente deve informar que não encontrou resposta e oferecer a abertura de chamado, sem mostrar artigo sem relação com a pergunta.</w:t>
             </w:r>
           </w:p>
         </w:tc>
@@ -7371,7 +7494,7 @@
               <w:pStyle w:val="Tabela"/>
             </w:pPr>
             <w:r>
-              <w:t>O sistema deve permitir no máximo um chamado por conversa; um novo problema exige uma nova conversa.</w:t>
+              <w:t>O sistema deve permitir no máximo um chamado por conversa; um problema novo exige uma conversa nova.</w:t>
             </w:r>
           </w:p>
         </w:tc>
@@ -7415,7 +7538,16 @@
               <w:pStyle w:val="Tabela"/>
             </w:pPr>
             <w:r>
-              <w:t>O sistema deve manter artigos com título, uma ou mais perguntas relacionadas, uma única categoria, resposta, links opcionais, situação, data da última atualização e autor da última atualização.</w:t>
+              <w:t xml:space="preserve">O sistema deve manter artigos com título, uma ou mais perguntas relacionadas, uma única categoria, resposta, </w:t>
+            </w:r>
+            <w:r>
+              <w:rPr>
+                <w:i/>
+              </w:rPr>
+              <w:t>links</w:t>
+            </w:r>
+            <w:r>
+              <w:t xml:space="preserve"> opcionais, situação, data da última atualização e autor da última atualização.</w:t>
             </w:r>
           </w:p>
         </w:tc>
@@ -7459,14 +7591,14 @@
               <w:pStyle w:val="Tabela"/>
             </w:pPr>
             <w:r>
-              <w:t xml:space="preserve">O sistema deve permitir que apenas o </w:t>
-            </w:r>
-            <w:r>
-              <w:t xml:space="preserve">administrador crie, edite, publique e arquive artigos, nas situações rascunho, publicado e arquivado; somente os publicados são usados </w:t>
+              <w:t xml:space="preserve">O sistema deve permitir que apenas o administrador crie, edite, publique e arquive artigos, nas situações rascunho, </w:t>
             </w:r>
             <w:r>
               <w:lastRenderedPageBreak/>
-              <w:t>pelo assistente.</w:t>
+              <w:t xml:space="preserve">publicado e arquivado; só os </w:t>
+            </w:r>
+            <w:r>
+              <w:t>publicados são usados pelo assistente.</w:t>
             </w:r>
           </w:p>
         </w:tc>
@@ -7555,7 +7687,7 @@
               <w:pStyle w:val="Tabela"/>
             </w:pPr>
             <w:r>
-              <w:t>O sistema deve criar o chamado somente depois que o aluno confirmar a oferta, permitindo que ele acrescente uma descrição opcional.</w:t>
+              <w:t>O sistema deve criar o chamado somente depois que o aluno confirmar a oferta, e permitir que ele acrescente uma descrição opcional.</w:t>
             </w:r>
           </w:p>
         </w:tc>
@@ -7599,10 +7731,7 @@
               <w:pStyle w:val="Tabela"/>
             </w:pPr>
             <w:r>
-              <w:t xml:space="preserve">O sistema deve preencher o chamado </w:t>
-            </w:r>
-            <w:r>
-              <w:t>automaticamente com o aluno solicitante, o curso e o semestre, a transcrição da conversa, os artigos exibidos, o título (primeira mensagem do aluno, truncada), a categoria (a do último artigo rejeitado ou, sem artigo, Não classificado) e o setor.</w:t>
+              <w:t>O sistema deve preencher o chamado automaticamente com o aluno solicitante, o curso e o semestre, a transcrição da conversa, os artigos exibidos, o título (primeira mensagem do aluno, truncada), a categoria (a do último artigo rejeitado ou, se nenhum artigo foi exibido, Não classificado) e o setor.</w:t>
             </w:r>
           </w:p>
         </w:tc>
@@ -7646,7 +7775,7 @@
               <w:pStyle w:val="Tabela"/>
             </w:pPr>
             <w:r>
-              <w:t>O sistema deve numerar os chamados no formato ONE-n, sequencial, único e nunca reutilizado, e mostrar o número ao aluno, junto com o chamado na sua lista.</w:t>
+              <w:t>O sistema deve numerar os chamados no formato ONE-n, de forma sequencial, única e sem reutilização, e mostrar o número ao aluno, junto com o chamado na lista dele.</w:t>
             </w:r>
           </w:p>
         </w:tc>
@@ -7690,7 +7819,7 @@
               <w:pStyle w:val="Tabela"/>
             </w:pPr>
             <w:r>
-              <w:t>O sistema deve manter cada chamado em exatamente um setor em todos os momentos.</w:t>
+              <w:t>O sistema deve manter cada chamado em exatamente um setor o tempo todo.</w:t>
             </w:r>
           </w:p>
         </w:tc>
@@ -7734,10 +7863,10 @@
               <w:pStyle w:val="Tabela"/>
             </w:pPr>
             <w:r>
-              <w:t xml:space="preserve">O sistema deve rotear o chamado uma única vez, na criação, pela regra da categoria (setor fixo ou coordenação do curso do aluno); sem regra, sem categoria ou com curso sem coordenação configurada, o chamado vai para o </w:t>
-            </w:r>
-            <w:r>
-              <w:t>setor de triagem.</w:t>
+              <w:t xml:space="preserve">O sistema deve rotear o chamado uma única vez, na criação, pela regra da </w:t>
+            </w:r>
+            <w:r>
+              <w:t>categoria (setor fixo ou coordenação do curso do aluno); se não houver regra, se o chamado for Não classificado ou se o curso não tiver coordenação configurada, o chamado vai para o setor de triagem.</w:t>
             </w:r>
           </w:p>
         </w:tc>
@@ -7825,7 +7954,7 @@
               <w:pStyle w:val="Tabela"/>
             </w:pPr>
             <w:r>
-              <w:t>O sistema deve permitir que o atendente reclassifique o chamado sem movê-lo de setor, mantendo a categoria original para os indicadores.</w:t>
+              <w:t>O sistema deve permitir que o atendente reclassifique o chamado sem mudá-lo de setor, mantendo a categoria original para os indicadores.</w:t>
             </w:r>
           </w:p>
         </w:tc>
@@ -7957,7 +8086,7 @@
               <w:pStyle w:val="Tabela"/>
             </w:pPr>
             <w:r>
-              <w:t>O sistema deve permitir que um atendente assuma um chamado atribuído a outro atendente do mesmo setor, registrando a troca.</w:t>
+              <w:t>O sistema deve permitir que um atendente assuma um chamado atribuído a outro atendente do mesmo setor e registrar a troca.</w:t>
             </w:r>
           </w:p>
         </w:tc>
@@ -8001,10 +8130,10 @@
               <w:pStyle w:val="Tabela"/>
             </w:pPr>
             <w:r>
-              <w:t xml:space="preserve">O sistema deve permitir que o </w:t>
-            </w:r>
-            <w:r>
-              <w:t>aluno envie respostas públicas em qualquer estado não fechado, e que os atendentes enviem respostas públicas e notas internas, estas nunca visíveis ao aluno.</w:t>
+              <w:t xml:space="preserve">O sistema deve permitir que o aluno envie respostas públicas em qualquer estado diferente de </w:t>
+            </w:r>
+            <w:r>
+              <w:t>Fechado, e que os atendentes enviem respostas públicas e notas internas, que o aluno nunca vê.</w:t>
             </w:r>
           </w:p>
         </w:tc>
@@ -8092,7 +8221,7 @@
               <w:pStyle w:val="Tabela"/>
             </w:pPr>
             <w:r>
-              <w:t>O sistema deve encaminhar o chamado somente para um setor diferente do atual e com motivo registrado como nota interna; o chamado volta a Aberto no setor de destino, sem responsável, e a contagem de encaminhamentos aumenta em 1.</w:t>
+              <w:t>O sistema deve encaminhar o chamado somente para um setor diferente do atual e com o motivo registrado como nota interna; o chamado volta a Aberto no setor de destino, sem responsável, e a contagem de encaminhamentos aumenta em 1.</w:t>
             </w:r>
           </w:p>
         </w:tc>
@@ -8136,7 +8265,7 @@
               <w:pStyle w:val="Tabela"/>
             </w:pPr>
             <w:r>
-              <w:t>O sistema deve aceitar anexos nas respostas públicas do aluno e dos atendentes, limitados aos tipos e ao tamanho permitidos (RNF-11).</w:t>
+              <w:t>O sistema deve aceitar anexos nas respostas públicas do aluno e dos atendentes, dentro dos tipos e do tamanho permitidos (RNF-11).</w:t>
             </w:r>
           </w:p>
         </w:tc>
@@ -8224,7 +8353,11 @@
               <w:pStyle w:val="Tabela"/>
             </w:pPr>
             <w:r>
-              <w:t>O sistema deve registrar no histórico, com autor, data e hora, cada criação, transição, atribuição, encaminhamento, reclassificação, resposta, nota e anexo; o histórico só recebe acréscimos e é visível a quem vê o chamado, exceto as notas internas para o aluno.</w:t>
+              <w:t xml:space="preserve">O sistema deve registrar no histórico, com autor, data e hora, cada criação, transição, atribuição, encaminhamento, reclassificação, resposta, nota e anexo; o histórico só recebe acréscimos e pode ser visto por quem vê o chamado, com </w:t>
+            </w:r>
+            <w:r>
+              <w:lastRenderedPageBreak/>
+              <w:t>exceção das notas internas, que o aluno não vê.</w:t>
             </w:r>
           </w:p>
         </w:tc>
@@ -8237,6 +8370,7 @@
               <w:pStyle w:val="Tabela"/>
             </w:pPr>
             <w:r>
+              <w:lastRenderedPageBreak/>
               <w:t>BR-H1, BR-H2</w:t>
             </w:r>
           </w:p>
@@ -8255,7 +8389,6 @@
               <w:pStyle w:val="Tabela"/>
             </w:pPr>
             <w:r>
-              <w:lastRenderedPageBreak/>
               <w:t>RF-31</w:t>
             </w:r>
           </w:p>
@@ -8269,10 +8402,10 @@
               <w:pStyle w:val="Tabela"/>
             </w:pPr>
             <w:r>
-              <w:t xml:space="preserve">O sistema deve mostrar ao administrador, por período, os indicadores do Quadro 12: alunos ativos, conversas, taxas de autoatendimento, escalonamento, abandono e </w:t>
-            </w:r>
-            <w:r>
-              <w:t>perguntas sem artigo, chamados abertos e resolvidos, tempo até a primeira resposta, tempo de resolução, roteamento correto, reabertura, principais categorias e o indicador principal.</w:t>
+              <w:t xml:space="preserve">O sistema deve mostrar ao administrador, por período, os indicadores do Quadro 12: alunos ativos, conversas, taxas de autoatendimento, de escalonamento, de abandono e de perguntas sem artigo, </w:t>
+            </w:r>
+            <w:r>
+              <w:t>chamados abertos e resolvidos, tempo até a primeira resposta, tempo de resolução, roteamento correto, reabertura, principais categorias e o indicador principal.</w:t>
             </w:r>
           </w:p>
         </w:tc>
@@ -8459,7 +8592,7 @@
               <w:keepNext/>
             </w:pPr>
             <w:r>
-              <w:t>—</w:t>
+              <w:t>Nenhum (criação)</w:t>
             </w:r>
           </w:p>
         </w:tc>
@@ -8590,10 +8723,7 @@
               <w:keepNext/>
             </w:pPr>
             <w:r>
-              <w:t xml:space="preserve">Atendente do </w:t>
-            </w:r>
-            <w:r>
-              <w:t>setor</w:t>
+              <w:t>Atendente do setor</w:t>
             </w:r>
           </w:p>
         </w:tc>
@@ -8607,7 +8737,10 @@
               <w:keepNext/>
             </w:pPr>
             <w:r>
-              <w:t>O atendente passa a ser o responsável</w:t>
+              <w:t xml:space="preserve">O </w:t>
+            </w:r>
+            <w:r>
+              <w:t>atendente passa a ser o responsável</w:t>
             </w:r>
           </w:p>
         </w:tc>
@@ -8696,7 +8829,7 @@
               <w:keepNext/>
             </w:pPr>
             <w:r>
-              <w:t>—</w:t>
+              <w:t>Nenhuma</w:t>
             </w:r>
           </w:p>
         </w:tc>
@@ -8963,7 +9096,7 @@
               <w:keepNext/>
             </w:pPr>
             <w:r>
-              <w:t>Somente dentro do prazo de confirmação; motivo obrigatório; reaberturas + 1</w:t>
+              <w:t>Só dentro do prazo de confirmação; motivo obrigatório; reaberturas + 1</w:t>
             </w:r>
           </w:p>
         </w:tc>
@@ -9024,7 +9157,10 @@
               <w:keepNext/>
             </w:pPr>
             <w:r>
-              <w:t>O aluno confirma, ou o prazo de confirmação vence</w:t>
+              <w:t xml:space="preserve">O aluno confirma, ou o </w:t>
+            </w:r>
+            <w:r>
+              <w:t>prazo de confirmação vence</w:t>
             </w:r>
           </w:p>
         </w:tc>
@@ -9233,7 +9369,7 @@
               <w:keepNext/>
             </w:pPr>
             <w:r>
-              <w:t>Conforme RF-27</w:t>
+              <w:t>Conforme o RF-27</w:t>
             </w:r>
           </w:p>
         </w:tc>
@@ -9251,7 +9387,7 @@
       <w:pPr>
         <w:pStyle w:val="Heading2"/>
       </w:pPr>
-      <w:bookmarkStart w:id="19" w:name="_Toc241855269"/>
+      <w:bookmarkStart w:id="19" w:name="_Toc241857850"/>
       <w:r>
         <w:t>4.2 REQUISITOS NÃO FUNCIONAIS</w:t>
       </w:r>
@@ -9259,7 +9395,7 @@
     </w:p>
     <w:p>
       <w:r>
-        <w:t>O Quadro 11 lista os requisitos não funcionais. A fonte de cada um é o manual da disciplina, uma lei, uma premissa ou uma decisão do grupo.</w:t>
+        <w:t>O Quadro 11 traz os requisitos não funcionais. A fonte de cada um é o manual da disciplina, uma lei, uma premissa ou uma decisão do grupo.</w:t>
       </w:r>
     </w:p>
     <w:p>
@@ -9401,10 +9537,34 @@
               <w:keepNext/>
             </w:pPr>
             <w:r>
-              <w:t xml:space="preserve">O sistema deve ser uma aplicação web </w:t>
-            </w:r>
-            <w:r>
-              <w:t>progressiva (PWA) instalável, com manifesto e service worker, com front-end SPA em React (Vite e vite-plugin-pwa) e back-end em ASP.NET Core Web API (C#/.NET) expondo uma API REST, com banco de dados PostgreSQL.</w:t>
+              <w:t xml:space="preserve">O sistema deve ser uma aplicação web progressiva (PWA) instalável, com manifesto e </w:t>
+            </w:r>
+            <w:r>
+              <w:rPr>
+                <w:i/>
+              </w:rPr>
+              <w:t>service worker</w:t>
+            </w:r>
+            <w:r>
+              <w:t xml:space="preserve">, com </w:t>
+            </w:r>
+            <w:r>
+              <w:rPr>
+                <w:i/>
+              </w:rPr>
+              <w:t>front-end</w:t>
+            </w:r>
+            <w:r>
+              <w:t xml:space="preserve"> SPA em React (Vite e vite-plugin-pwa) e </w:t>
+            </w:r>
+            <w:r>
+              <w:rPr>
+                <w:i/>
+              </w:rPr>
+              <w:t>back-end</w:t>
+            </w:r>
+            <w:r>
+              <w:t xml:space="preserve"> em ASP.NET Core Web API (C#/.NET) expondo uma API REST, usando o banco de dados PostgreSQL.</w:t>
             </w:r>
           </w:p>
         </w:tc>
@@ -9465,7 +9625,16 @@
               <w:keepNext/>
             </w:pPr>
             <w:r>
-              <w:t>A interface deve ser utilizável em navegadores de celular e de computador, ajustando o leiaute à largura da tela.</w:t>
+              <w:t xml:space="preserve">A interface deve funcionar em navegadores de celular e de computador, ajustando o </w:t>
+            </w:r>
+            <w:r>
+              <w:rPr>
+                <w:i/>
+              </w:rPr>
+              <w:t>layout</w:t>
+            </w:r>
+            <w:r>
+              <w:t xml:space="preserve"> à largura da tela.</w:t>
             </w:r>
           </w:p>
         </w:tc>
@@ -9479,7 +9648,7 @@
               <w:keepNext/>
             </w:pPr>
             <w:r>
-              <w:t>Tema do PEI IV; a maior parte das mensagens hoje chega pelo celular (Quadro 5)</w:t>
+              <w:t>Tema do PEI IV; hoje a maior parte das mensagens chega pelo celular (Quadro 5)</w:t>
             </w:r>
           </w:p>
         </w:tc>
@@ -9587,7 +9756,7 @@
               <w:keepNext/>
             </w:pPr>
             <w:r>
-              <w:t>O tratamento de dados pessoais deve seguir a LGPD, coletando apenas os dados necessários ao atendimento: nome, e-mail, curso, semestre e setor.</w:t>
+              <w:t>O tratamento de dados pessoais deve seguir a LGPD e coletar apenas os dados necessários ao atendimento: nome, e-mail, curso, semestre e setor.</w:t>
             </w:r>
           </w:p>
         </w:tc>
@@ -9709,7 +9878,7 @@
               <w:keepNext/>
             </w:pPr>
             <w:r>
-              <w:t>A aplicação não deve oferecer meio de alterar ou apagar chamados, mensagens e eventos do histórico; o prazo de retenção segue a exigência do MEC, ainda pendente.</w:t>
+              <w:t>A aplicação não deve oferecer nenhum meio de alterar ou apagar chamados, mensagens e eventos do histórico; o prazo de retenção vai seguir a exigência do MEC, que ainda está pendente.</w:t>
             </w:r>
           </w:p>
         </w:tc>
@@ -9831,7 +10000,7 @@
               <w:keepNext/>
             </w:pPr>
             <w:r>
-              <w:t>O produto mínimo viável não deve se integrar a sistema acadêmico, Portal do Aluno ou Moodle; os artigos apenas indicam ao aluno o caminho no Portal do Aluno.</w:t>
+              <w:t>O produto mínimo viável não deve se integrar ao sistema acadêmico, ao Portal do Aluno nem ao Moodle; os artigos apenas indicam ao aluno o caminho no Portal do Aluno.</w:t>
             </w:r>
           </w:p>
         </w:tc>
@@ -9892,10 +10061,16 @@
               <w:keepNext/>
             </w:pPr>
             <w:r>
-              <w:t xml:space="preserve">As notificações ao aluno devem ser </w:t>
-            </w:r>
-            <w:r>
-              <w:t>feitas por e-mail, sem notificações push.</w:t>
+              <w:t xml:space="preserve">As notificações ao aluno devem ser feitas por e-mail, sem notificações </w:t>
+            </w:r>
+            <w:r>
+              <w:rPr>
+                <w:i/>
+              </w:rPr>
+              <w:t>push</w:t>
+            </w:r>
+            <w:r>
+              <w:t>.</w:t>
             </w:r>
           </w:p>
         </w:tc>
@@ -9956,7 +10131,7 @@
               <w:keepNext/>
             </w:pPr>
             <w:r>
-              <w:t>O código-fonte deve ficar em repositório público no GitHub, e a documentação deve seguir as normas da ABNT.</w:t>
+              <w:t>O código-fonte deve ficar em um repositório público no GitHub, e a documentação deve seguir as normas da ABNT.</w:t>
             </w:r>
           </w:p>
         </w:tc>
@@ -9970,7 +10145,7 @@
               <w:keepNext/>
             </w:pPr>
             <w:r>
-              <w:t>Manual do PEI, Apêndice D e Apêndice F (UNIVAG, 2026)</w:t>
+              <w:t>Manual do PEI, Apêndices D e F (UNIVAG, 2026)</w:t>
             </w:r>
           </w:p>
         </w:tc>
@@ -10048,7 +10223,7 @@
     <w:p>
       <w:r>
         <w:lastRenderedPageBreak/>
-        <w:t>Os indicadores calculados pelo painel estão definidos no Quadro 12. A parte do resultado que depende de o aluno não procurar outro canal, assim como a redução de mensagens diretas à coordenação, não pode ser medida pelo sistema e será medida no piloto, comparando com a linha de base do Quadro 5.</w:t>
+        <w:t>Os indicadores do painel estão definidos no Quadro 12. O sistema não consegue medir duas coisas: se o aluno deixou de procurar outros canais e se as mensagens diretas à coordenação diminuíram. Essas duas vão ser medidas no piloto, em comparação com a linha de base do Quadro 5.</w:t>
       </w:r>
     </w:p>
     <w:p>
@@ -10135,10 +10310,7 @@
               <w:pStyle w:val="Tabela"/>
             </w:pPr>
             <w:r>
-              <w:t xml:space="preserve">Alunos </w:t>
-            </w:r>
-            <w:r>
-              <w:t>distintos com pelo menos uma conversa no período</w:t>
+              <w:t>Alunos diferentes com pelo menos uma conversa no período</w:t>
             </w:r>
           </w:p>
         </w:tc>
@@ -10293,7 +10465,7 @@
               <w:pStyle w:val="Tabela"/>
             </w:pPr>
             <w:r>
-              <w:t>Conversas em que nenhum artigo correspondeu, divididas pelas conversas</w:t>
+              <w:t>Conversas em que nenhum artigo correspondeu à pergunta, divididas pelas conversas</w:t>
             </w:r>
           </w:p>
         </w:tc>
@@ -10324,10 +10496,7 @@
               <w:pStyle w:val="Tabela"/>
             </w:pPr>
             <w:r>
-              <w:t xml:space="preserve">Chamados que não estão </w:t>
-            </w:r>
-            <w:r>
-              <w:t>fechados no momento da consulta</w:t>
+              <w:t>Chamados que não estão fechados no momento da consulta</w:t>
             </w:r>
           </w:p>
         </w:tc>
@@ -10389,7 +10558,10 @@
               <w:pStyle w:val="Tabela"/>
             </w:pPr>
             <w:r>
-              <w:t>Da criação do chamado à primeira resposta pública de atendente</w:t>
+              <w:t xml:space="preserve">Da criação do chamado até a primeira resposta pública de um </w:t>
+            </w:r>
+            <w:r>
+              <w:t>atendente</w:t>
             </w:r>
           </w:p>
         </w:tc>
@@ -10420,7 +10592,7 @@
               <w:pStyle w:val="Tabela"/>
             </w:pPr>
             <w:r>
-              <w:t>Da criação do chamado à última transição para Resolvido</w:t>
+              <w:t>Da criação do chamado até a última transição para Resolvido</w:t>
             </w:r>
           </w:p>
         </w:tc>
@@ -10513,7 +10685,7 @@
               <w:pStyle w:val="Tabela"/>
             </w:pPr>
             <w:r>
-              <w:t>Ranking por conversas (categoria do artigo) e por chamados (categoria original)</w:t>
+              <w:t>Classificação das categorias pelo número de conversas (categoria do artigo) e de chamados (categoria original)</w:t>
             </w:r>
           </w:p>
         </w:tc>
@@ -10562,7 +10734,7 @@
       <w:pPr>
         <w:pStyle w:val="Heading1"/>
       </w:pPr>
-      <w:bookmarkStart w:id="20" w:name="_Toc241855270"/>
+      <w:bookmarkStart w:id="20" w:name="_Toc241857851"/>
       <w:r>
         <w:lastRenderedPageBreak/>
         <w:t>5 DOCUMENTAÇÃO DAS FUNCIONALIDADES</w:t>
@@ -10573,18 +10745,18 @@
       <w:pPr>
         <w:pStyle w:val="Heading2"/>
       </w:pPr>
-      <w:bookmarkStart w:id="21" w:name="_Toc241855271"/>
+      <w:bookmarkStart w:id="21" w:name="_Toc241857852"/>
       <w:r>
-        <w:t>5.1 DIAGRAMA DE CASOS DE USO</w:t>
+        <w:t xml:space="preserve">5.1 DIAGRAMA DE CASOS DE </w:t>
+      </w:r>
+      <w:r>
+        <w:t>USO</w:t>
       </w:r>
       <w:bookmarkEnd w:id="21"/>
     </w:p>
     <w:p>
       <w:r>
-        <w:t xml:space="preserve">A Figura 1 mostra os doze casos de uso do produto mínimo viável e os atores </w:t>
-      </w:r>
-      <w:r>
-        <w:t>envolvidos. Além dos três perfis de usuário, aparecem dois sistemas externos, o provedor de IA e o serviço de e-mail, e o agendador, que encerra conversas e chamados quando um prazo vence. O caso de uso Abrir chamado estende Conversar com o assistente, porque só ocorre quando a conversa não resolve a dúvida.</w:t>
+        <w:t>A Figura 1 mostra os doze casos de uso do produto mínimo viável e os atores envolvidos. Além dos três perfis de usuário, aparecem dois sistemas externos, o provedor de IA e o serviço de e-mail, e o agendador, que encerra conversas e chamados quando um prazo vence. O caso de uso Abrir chamado estende Conversar com o assistente, porque só acontece quando a conversa não resolve a dúvida.</w:t>
       </w:r>
     </w:p>
     <w:p>
@@ -10606,8 +10778,8 @@
           <w:noProof/>
         </w:rPr>
         <w:drawing>
-          <wp:inline distT="0" distB="0" distL="0" distR="0" wp14:anchorId="468754B7" wp14:editId="50C9D509">
-            <wp:extent cx="5033632" cy="7559999"/>
+          <wp:inline distT="0" distB="0" distL="0" distR="0" wp14:anchorId="045A02BC" wp14:editId="0C27A876">
+            <wp:extent cx="5112684" cy="7559999"/>
             <wp:effectExtent l="0" t="0" r="0" b="0"/>
             <wp:docPr id="2" name="Picture 2"/>
             <wp:cNvGraphicFramePr>
@@ -10629,7 +10801,7 @@
                   <pic:spPr>
                     <a:xfrm>
                       <a:off x="0" y="0"/>
-                      <a:ext cx="5033632" cy="7559999"/>
+                      <a:ext cx="5112684" cy="7559999"/>
                     </a:xfrm>
                     <a:prstGeom prst="rect">
                       <a:avLst/>
@@ -10655,7 +10827,7 @@
       <w:pPr>
         <w:pStyle w:val="Heading2"/>
       </w:pPr>
-      <w:bookmarkStart w:id="22" w:name="_Toc241855272"/>
+      <w:bookmarkStart w:id="22" w:name="_Toc241857853"/>
       <w:r>
         <w:t>5.2 ESPECIFICAÇÕES DOS CASOS DE USO</w:t>
       </w:r>
@@ -10663,7 +10835,7 @@
     </w:p>
     <w:p>
       <w:r>
-        <w:t>Os Quadros 13 a 24 especificam cada caso de uso.</w:t>
+        <w:t>Os Quadros 13 a 24 trazem a especificação de cada caso de uso.</w:t>
       </w:r>
     </w:p>
     <w:p>
@@ -10821,7 +10993,10 @@
               <w:keepNext/>
             </w:pPr>
             <w:r>
-              <w:t>A conta foi criada pelo administrador e está ativa (premissa Q5).</w:t>
+              <w:t xml:space="preserve">A conta foi criada pelo administrador e está ativa </w:t>
+            </w:r>
+            <w:r>
+              <w:t>(premissa Q5).</w:t>
             </w:r>
           </w:p>
         </w:tc>
@@ -10863,10 +11038,7 @@
               <w:keepNext/>
             </w:pPr>
             <w:r>
-              <w:t xml:space="preserve">2. O sistema valida as </w:t>
-            </w:r>
-            <w:r>
-              <w:t>credenciais e a situação da conta.</w:t>
+              <w:t>2. O sistema valida as credenciais e a situação da conta.</w:t>
             </w:r>
           </w:p>
           <w:p>
@@ -11085,10 +11257,7 @@
               <w:keepNext/>
             </w:pPr>
             <w:r>
-              <w:t xml:space="preserve">Conversar com o </w:t>
-            </w:r>
-            <w:r>
-              <w:t>assistente</w:t>
+              <w:t>Conversar com o assistente</w:t>
             </w:r>
           </w:p>
         </w:tc>
@@ -11154,7 +11323,7 @@
               <w:keepNext/>
             </w:pPr>
             <w:r>
-              <w:t>O aluno está autenticado e viu o aviso sobre o uso de IA externa.</w:t>
+              <w:t>O aluno está autenticado e já viu o aviso sobre o uso de IA externa.</w:t>
             </w:r>
           </w:p>
         </w:tc>
@@ -11187,7 +11356,10 @@
               <w:keepNext/>
             </w:pPr>
             <w:r>
-              <w:t>1. O aluno descreve a dúvida em texto livre.</w:t>
+              <w:t xml:space="preserve">1. O aluno descreve a dúvida em </w:t>
+            </w:r>
+            <w:r>
+              <w:t>texto livre.</w:t>
             </w:r>
           </w:p>
           <w:p>
@@ -11256,28 +11428,28 @@
               <w:keepNext/>
             </w:pPr>
             <w:r>
-              <w:t>2a. Nenhum artigo corresponde: o sistema informa que não encontrou resposta e oferece abrir chamado (UC-03).</w:t>
-            </w:r>
-          </w:p>
-          <w:p>
-            <w:pPr>
-              <w:pStyle w:val="Tabela"/>
-              <w:keepNext/>
-            </w:pPr>
-            <w:r>
-              <w:t>4a. O aluno responde Não: o sistema oferece abrir chamado (UC-03); se o aluno recusar, a conversa termina como recusada.</w:t>
-            </w:r>
-          </w:p>
-          <w:p>
-            <w:pPr>
-              <w:pStyle w:val="Tabela"/>
-              <w:keepNext/>
-            </w:pPr>
-            <w:r>
-              <w:t xml:space="preserve">4b. O aluno não </w:t>
-            </w:r>
-            <w:r>
-              <w:t>responde dentro da janela de inatividade: a conversa termina como abandonada (UC-12).</w:t>
+              <w:t>2a. Nenhum artigo corresponde à pergunta: o sistema informa que não encontrou resposta e oferece abrir um chamado (UC-03).</w:t>
+            </w:r>
+          </w:p>
+          <w:p>
+            <w:pPr>
+              <w:pStyle w:val="Tabela"/>
+              <w:keepNext/>
+            </w:pPr>
+            <w:r>
+              <w:t xml:space="preserve">4a. O aluno responde Não: o sistema oferece </w:t>
+            </w:r>
+            <w:r>
+              <w:t>abrir um chamado (UC-03); se o aluno recusar, a conversa termina como recusada.</w:t>
+            </w:r>
+          </w:p>
+          <w:p>
+            <w:pPr>
+              <w:pStyle w:val="Tabela"/>
+              <w:keepNext/>
+            </w:pPr>
+            <w:r>
+              <w:t>4b. O aluno não responde dentro da janela de inatividade: a conversa termina como abandonada (UC-12).</w:t>
             </w:r>
           </w:p>
         </w:tc>
@@ -11375,8 +11547,8 @@
         <w:tblLook w:val="04A0" w:firstRow="1" w:lastRow="0" w:firstColumn="1" w:lastColumn="0" w:noHBand="0" w:noVBand="1"/>
       </w:tblPr>
       <w:tblGrid>
-        <w:gridCol w:w="3141"/>
-        <w:gridCol w:w="5930"/>
+        <w:gridCol w:w="3171"/>
+        <w:gridCol w:w="5900"/>
       </w:tblGrid>
       <w:tr>
         <w:trPr>
@@ -11385,7 +11557,7 @@
         </w:trPr>
         <w:tc>
           <w:tcPr>
-            <w:tcW w:w="3141" w:type="dxa"/>
+            <w:tcW w:w="3171" w:type="dxa"/>
           </w:tcPr>
           <w:p>
             <w:pPr>
@@ -11402,7 +11574,7 @@
         </w:tc>
         <w:tc>
           <w:tcPr>
-            <w:tcW w:w="5930" w:type="dxa"/>
+            <w:tcW w:w="5900" w:type="dxa"/>
           </w:tcPr>
           <w:p>
             <w:pPr>
@@ -11424,7 +11596,7 @@
         </w:trPr>
         <w:tc>
           <w:tcPr>
-            <w:tcW w:w="3141" w:type="dxa"/>
+            <w:tcW w:w="3171" w:type="dxa"/>
           </w:tcPr>
           <w:p>
             <w:pPr>
@@ -11438,7 +11610,7 @@
         </w:tc>
         <w:tc>
           <w:tcPr>
-            <w:tcW w:w="5930" w:type="dxa"/>
+            <w:tcW w:w="5900" w:type="dxa"/>
           </w:tcPr>
           <w:p>
             <w:pPr>
@@ -11457,7 +11629,7 @@
         </w:trPr>
         <w:tc>
           <w:tcPr>
-            <w:tcW w:w="3141" w:type="dxa"/>
+            <w:tcW w:w="3171" w:type="dxa"/>
           </w:tcPr>
           <w:p>
             <w:pPr>
@@ -11471,7 +11643,7 @@
         </w:tc>
         <w:tc>
           <w:tcPr>
-            <w:tcW w:w="5930" w:type="dxa"/>
+            <w:tcW w:w="5900" w:type="dxa"/>
           </w:tcPr>
           <w:p>
             <w:pPr>
@@ -11490,7 +11662,7 @@
         </w:trPr>
         <w:tc>
           <w:tcPr>
-            <w:tcW w:w="3141" w:type="dxa"/>
+            <w:tcW w:w="3171" w:type="dxa"/>
           </w:tcPr>
           <w:p>
             <w:pPr>
@@ -11504,15 +11676,18 @@
         </w:tc>
         <w:tc>
           <w:tcPr>
-            <w:tcW w:w="5930" w:type="dxa"/>
-          </w:tcPr>
-          <w:p>
-            <w:pPr>
-              <w:pStyle w:val="Tabela"/>
-              <w:keepNext/>
-            </w:pPr>
-            <w:r>
-              <w:t>Há uma conversa sem desfecho em que o aluno respondeu Não ou em que nenhum artigo correspondeu.</w:t>
+            <w:tcW w:w="5900" w:type="dxa"/>
+          </w:tcPr>
+          <w:p>
+            <w:pPr>
+              <w:pStyle w:val="Tabela"/>
+              <w:keepNext/>
+            </w:pPr>
+            <w:r>
+              <w:t xml:space="preserve">Existe uma </w:t>
+            </w:r>
+            <w:r>
+              <w:t>conversa sem desfecho em que o aluno respondeu Não ou em que nenhum artigo correspondeu à pergunta.</w:t>
             </w:r>
           </w:p>
         </w:tc>
@@ -11523,24 +11698,21 @@
         </w:trPr>
         <w:tc>
           <w:tcPr>
-            <w:tcW w:w="3141" w:type="dxa"/>
-          </w:tcPr>
-          <w:p>
-            <w:pPr>
-              <w:pStyle w:val="Tabela"/>
-              <w:keepNext/>
-            </w:pPr>
-            <w:r>
-              <w:t xml:space="preserve">Fluxo </w:t>
-            </w:r>
-            <w:r>
-              <w:t>principal</w:t>
-            </w:r>
-          </w:p>
-        </w:tc>
-        <w:tc>
-          <w:tcPr>
-            <w:tcW w:w="5930" w:type="dxa"/>
+            <w:tcW w:w="3171" w:type="dxa"/>
+          </w:tcPr>
+          <w:p>
+            <w:pPr>
+              <w:pStyle w:val="Tabela"/>
+              <w:keepNext/>
+            </w:pPr>
+            <w:r>
+              <w:t>Fluxo principal</w:t>
+            </w:r>
+          </w:p>
+        </w:tc>
+        <w:tc>
+          <w:tcPr>
+            <w:tcW w:w="5900" w:type="dxa"/>
           </w:tcPr>
           <w:p>
             <w:pPr>
@@ -11557,7 +11729,7 @@
               <w:keepNext/>
             </w:pPr>
             <w:r>
-              <w:t>2. O aluno acrescenta, se quiser, uma descrição.</w:t>
+              <w:t>2. O aluno acrescenta uma descrição, se quiser.</w:t>
             </w:r>
           </w:p>
           <w:p>
@@ -11604,7 +11776,7 @@
         </w:trPr>
         <w:tc>
           <w:tcPr>
-            <w:tcW w:w="3141" w:type="dxa"/>
+            <w:tcW w:w="3171" w:type="dxa"/>
           </w:tcPr>
           <w:p>
             <w:pPr>
@@ -11618,15 +11790,15 @@
         </w:tc>
         <w:tc>
           <w:tcPr>
-            <w:tcW w:w="5930" w:type="dxa"/>
-          </w:tcPr>
-          <w:p>
-            <w:pPr>
-              <w:pStyle w:val="Tabela"/>
-              <w:keepNext/>
-            </w:pPr>
-            <w:r>
-              <w:t>3a. O aluno não confirma: nenhum chamado é criado e a conversa termina como recusada.</w:t>
+            <w:tcW w:w="5900" w:type="dxa"/>
+          </w:tcPr>
+          <w:p>
+            <w:pPr>
+              <w:pStyle w:val="Tabela"/>
+              <w:keepNext/>
+            </w:pPr>
+            <w:r>
+              <w:t>3a. O aluno não confirma: nenhum chamado é criado, e a conversa termina como recusada.</w:t>
             </w:r>
           </w:p>
           <w:p>
@@ -11646,7 +11818,7 @@
         </w:trPr>
         <w:tc>
           <w:tcPr>
-            <w:tcW w:w="3141" w:type="dxa"/>
+            <w:tcW w:w="3171" w:type="dxa"/>
           </w:tcPr>
           <w:p>
             <w:pPr>
@@ -11660,7 +11832,7 @@
         </w:tc>
         <w:tc>
           <w:tcPr>
-            <w:tcW w:w="5930" w:type="dxa"/>
+            <w:tcW w:w="5900" w:type="dxa"/>
           </w:tcPr>
           <w:p>
             <w:pPr>
@@ -11679,7 +11851,7 @@
         </w:trPr>
         <w:tc>
           <w:tcPr>
-            <w:tcW w:w="3141" w:type="dxa"/>
+            <w:tcW w:w="3171" w:type="dxa"/>
           </w:tcPr>
           <w:p>
             <w:pPr>
@@ -11693,7 +11865,7 @@
         </w:tc>
         <w:tc>
           <w:tcPr>
-            <w:tcW w:w="5930" w:type="dxa"/>
+            <w:tcW w:w="5900" w:type="dxa"/>
           </w:tcPr>
           <w:p>
             <w:pPr>
@@ -11869,10 +12041,7 @@
               <w:keepNext/>
             </w:pPr>
             <w:r>
-              <w:t xml:space="preserve">O aluno está autenticado e tem ao </w:t>
-            </w:r>
-            <w:r>
-              <w:t>menos um chamado.</w:t>
+              <w:t>O aluno está autenticado e tem pelo menos um chamado.</w:t>
             </w:r>
           </w:p>
         </w:tc>
@@ -11914,7 +12083,10 @@
               <w:keepNext/>
             </w:pPr>
             <w:r>
-              <w:t>2. O sistema mostra número, estado e respostas públicas, sem as notas internas.</w:t>
+              <w:t xml:space="preserve">2. O sistema mostra número, estado e respostas públicas, sem as </w:t>
+            </w:r>
+            <w:r>
+              <w:t>notas internas.</w:t>
             </w:r>
           </w:p>
           <w:p>
@@ -11932,10 +12104,7 @@
               <w:keepNext/>
             </w:pPr>
             <w:r>
-              <w:t xml:space="preserve">4. Se o chamado estava em Aguardando </w:t>
-            </w:r>
-            <w:r>
-              <w:t>aluno, o sistema o devolve a Em atendimento.</w:t>
+              <w:t>4. Se o chamado estava em Aguardando aluno, o sistema o devolve para Em atendimento.</w:t>
             </w:r>
           </w:p>
           <w:p>
@@ -11977,7 +12146,7 @@
               <w:keepNext/>
             </w:pPr>
             <w:r>
-              <w:t>3a. O aluno cancela um chamado não fechado: o chamado é fechado como cancelado.</w:t>
+              <w:t>3a. O aluno cancela um chamado que não está fechado: o chamado é fechado como cancelado.</w:t>
             </w:r>
           </w:p>
           <w:p>
@@ -11995,19 +12164,16 @@
               <w:keepNext/>
             </w:pPr>
             <w:r>
-              <w:t>5a. O aluno rejeita a resolução dentro do prazo de confirmação, informando o motivo: o chamado volta a Em atendimento e a contagem de reaberturas aumenta.</w:t>
-            </w:r>
-          </w:p>
-          <w:p>
-            <w:pPr>
-              <w:pStyle w:val="Tabela"/>
-              <w:keepNext/>
-            </w:pPr>
-            <w:r>
-              <w:t xml:space="preserve">5b. O prazo vence sem </w:t>
-            </w:r>
-            <w:r>
-              <w:t>resposta: o chamado é fechado automaticamente (UC-12).</w:t>
+              <w:t>5a. O aluno rejeita a resolução dentro do prazo de confirmação e informa o motivo: o chamado volta para Em atendimento, e a contagem de reaberturas aumenta.</w:t>
+            </w:r>
+          </w:p>
+          <w:p>
+            <w:pPr>
+              <w:pStyle w:val="Tabela"/>
+              <w:keepNext/>
+            </w:pPr>
+            <w:r>
+              <w:t>5b. O prazo vence sem resposta: o chamado é fechado automaticamente (UC-12).</w:t>
             </w:r>
           </w:p>
         </w:tc>
@@ -12242,7 +12408,10 @@
               <w:keepNext/>
             </w:pPr>
             <w:r>
-              <w:t>O atendente está autenticado, e o chamado está em um dos seus setores.</w:t>
+              <w:t xml:space="preserve">O atendente está </w:t>
+            </w:r>
+            <w:r>
+              <w:t>autenticado, e o chamado está em um dos seus setores.</w:t>
             </w:r>
           </w:p>
         </w:tc>
@@ -12284,10 +12453,7 @@
               <w:keepNext/>
             </w:pPr>
             <w:r>
-              <w:t xml:space="preserve">2. O </w:t>
-            </w:r>
-            <w:r>
-              <w:t>atendente assume o chamado, ou envia a primeira resposta pública, e passa a ser o responsável.</w:t>
+              <w:t>2. O atendente assume o chamado, ou envia a primeira resposta pública, e passa a ser o responsável.</w:t>
             </w:r>
           </w:p>
           <w:p>
@@ -12305,16 +12471,16 @@
               <w:keepNext/>
             </w:pPr>
             <w:r>
-              <w:t>4. O atendente envia respostas públicas e notas internas, e pode marcar uma resposta como aguardando o aluno.</w:t>
-            </w:r>
-          </w:p>
-          <w:p>
-            <w:pPr>
-              <w:pStyle w:val="Tabela"/>
-              <w:keepNext/>
-            </w:pPr>
-            <w:r>
-              <w:t>5. O atendente resolve o chamado, informando o texto da resolução.</w:t>
+              <w:t>4. O atendente envia respostas públicas e notas internas e pode marcar uma resposta como aguardando o aluno.</w:t>
+            </w:r>
+          </w:p>
+          <w:p>
+            <w:pPr>
+              <w:pStyle w:val="Tabela"/>
+              <w:keepNext/>
+            </w:pPr>
+            <w:r>
+              <w:t>5. O atendente resolve o chamado e informa o texto da resolução.</w:t>
             </w:r>
           </w:p>
         </w:tc>
@@ -12347,28 +12513,25 @@
               <w:keepNext/>
             </w:pPr>
             <w:r>
-              <w:t>2a. O chamado está atribuído a outro atendente do setor: o atendente pode assumi-lo, e a troca é registrada.</w:t>
-            </w:r>
-          </w:p>
-          <w:p>
-            <w:pPr>
-              <w:pStyle w:val="Tabela"/>
-              <w:keepNext/>
-            </w:pPr>
-            <w:r>
-              <w:t xml:space="preserve">4a. O anexo </w:t>
-            </w:r>
-            <w:r>
-              <w:t>está fora dos tipos ou do tamanho permitidos: o sistema recusa o anexo.</w:t>
-            </w:r>
-          </w:p>
-          <w:p>
-            <w:pPr>
-              <w:pStyle w:val="Tabela"/>
-              <w:keepNext/>
-            </w:pPr>
-            <w:r>
-              <w:t>5a. A resolução não tem texto: o sistema recusa.</w:t>
+              <w:t>2a. O chamado está atribuído a outro atendente do setor: o atendente pode assumi-lo, e a troca fica registrada.</w:t>
+            </w:r>
+          </w:p>
+          <w:p>
+            <w:pPr>
+              <w:pStyle w:val="Tabela"/>
+              <w:keepNext/>
+            </w:pPr>
+            <w:r>
+              <w:t>4a. O anexo está fora dos tipos ou do tamanho permitidos: o sistema recusa o anexo.</w:t>
+            </w:r>
+          </w:p>
+          <w:p>
+            <w:pPr>
+              <w:pStyle w:val="Tabela"/>
+              <w:keepNext/>
+            </w:pPr>
+            <w:r>
+              <w:t>5a. A resolução está sem texto: o sistema recusa.</w:t>
             </w:r>
           </w:p>
         </w:tc>
@@ -12602,10 +12765,7 @@
               <w:keepNext/>
             </w:pPr>
             <w:r>
-              <w:t xml:space="preserve">O chamado não está fechado e está em um setor do </w:t>
-            </w:r>
-            <w:r>
-              <w:t>atendente.</w:t>
+              <w:t>O chamado não está fechado e está em um setor do atendente.</w:t>
             </w:r>
           </w:p>
         </w:tc>
@@ -12647,7 +12807,10 @@
               <w:keepNext/>
             </w:pPr>
             <w:r>
-              <w:t>2. O sistema registra o motivo como nota interna, move o chamado para Aberto no setor de destino, remove o responsável e soma 1 à contagem de encaminhamentos.</w:t>
+              <w:t xml:space="preserve">2. O sistema registra o motivo como </w:t>
+            </w:r>
+            <w:r>
+              <w:t>nota interna, move o chamado para Aberto no setor de destino, tira o responsável e soma 1 à contagem de encaminhamentos.</w:t>
             </w:r>
           </w:p>
         </w:tc>
@@ -12947,19 +13110,16 @@
               <w:keepNext/>
             </w:pPr>
             <w:r>
-              <w:t xml:space="preserve">1. O atendente escolhe uma </w:t>
-            </w:r>
-            <w:r>
-              <w:t>nova categoria.</w:t>
-            </w:r>
-          </w:p>
-          <w:p>
-            <w:pPr>
-              <w:pStyle w:val="Tabela"/>
-              <w:keepNext/>
-            </w:pPr>
-            <w:r>
-              <w:t>2. O sistema altera a categoria atual, mantém a categoria original para os indicadores e registra a ação, sem mover o chamado.</w:t>
+              <w:t>1. O atendente escolhe uma nova categoria.</w:t>
+            </w:r>
+          </w:p>
+          <w:p>
+            <w:pPr>
+              <w:pStyle w:val="Tabela"/>
+              <w:keepNext/>
+            </w:pPr>
+            <w:r>
+              <w:t>2. O sistema altera a categoria atual, mantém a categoria original para os indicadores e registra a ação, sem mudar o chamado de setor.</w:t>
             </w:r>
           </w:p>
         </w:tc>
@@ -13260,7 +13420,16 @@
               <w:keepNext/>
             </w:pPr>
             <w:r>
-              <w:t>1. O administrador cria um artigo com título, perguntas relacionadas, categoria, resposta e links.</w:t>
+              <w:t xml:space="preserve">1. O administrador cria um artigo com título, perguntas relacionadas, categoria, resposta e </w:t>
+            </w:r>
+            <w:r>
+              <w:rPr>
+                <w:i/>
+              </w:rPr>
+              <w:t>links</w:t>
+            </w:r>
+            <w:r>
+              <w:t>.</w:t>
             </w:r>
           </w:p>
           <w:p>
@@ -13278,19 +13447,16 @@
               <w:keepNext/>
             </w:pPr>
             <w:r>
-              <w:t xml:space="preserve">3. O </w:t>
-            </w:r>
-            <w:r>
-              <w:t>administrador publica o artigo.</w:t>
-            </w:r>
-          </w:p>
-          <w:p>
-            <w:pPr>
-              <w:pStyle w:val="Tabela"/>
-              <w:keepNext/>
-            </w:pPr>
-            <w:r>
-              <w:t>4. Ao editar um artigo publicado, o sistema cria uma nova versão e preserva a anterior.</w:t>
+              <w:t>3. O administrador publica o artigo.</w:t>
+            </w:r>
+          </w:p>
+          <w:p>
+            <w:pPr>
+              <w:pStyle w:val="Tabela"/>
+              <w:keepNext/>
+            </w:pPr>
+            <w:r>
+              <w:t>4. Quando um artigo publicado é editado, o sistema cria uma nova versão e preserva a anterior.</w:t>
             </w:r>
           </w:p>
         </w:tc>
@@ -13323,7 +13489,7 @@
               <w:keepNext/>
             </w:pPr>
             <w:r>
-              <w:t>1a. O artigo não tem categoria ou pergunta relacionada: o sistema recusa.</w:t>
+              <w:t>1a. O artigo está sem categoria ou sem pergunta relacionada: o sistema recusa.</w:t>
             </w:r>
           </w:p>
           <w:p>
@@ -13365,7 +13531,10 @@
               <w:keepNext/>
             </w:pPr>
             <w:r>
-              <w:t>Somente os artigos publicados ficam disponíveis para o assistente.</w:t>
+              <w:t xml:space="preserve">Só os artigos publicados ficam </w:t>
+            </w:r>
+            <w:r>
+              <w:t>disponíveis para o assistente.</w:t>
             </w:r>
           </w:p>
         </w:tc>
@@ -13429,8 +13598,8 @@
         <w:tblLook w:val="04A0" w:firstRow="1" w:lastRow="0" w:firstColumn="1" w:lastColumn="0" w:noHBand="0" w:noVBand="1"/>
       </w:tblPr>
       <w:tblGrid>
-        <w:gridCol w:w="3081"/>
-        <w:gridCol w:w="5990"/>
+        <w:gridCol w:w="3141"/>
+        <w:gridCol w:w="5930"/>
       </w:tblGrid>
       <w:tr>
         <w:trPr>
@@ -13439,7 +13608,7 @@
         </w:trPr>
         <w:tc>
           <w:tcPr>
-            <w:tcW w:w="3081" w:type="dxa"/>
+            <w:tcW w:w="3141" w:type="dxa"/>
           </w:tcPr>
           <w:p>
             <w:pPr>
@@ -13456,7 +13625,7 @@
         </w:tc>
         <w:tc>
           <w:tcPr>
-            <w:tcW w:w="5990" w:type="dxa"/>
+            <w:tcW w:w="5930" w:type="dxa"/>
           </w:tcPr>
           <w:p>
             <w:pPr>
@@ -13478,7 +13647,7 @@
         </w:trPr>
         <w:tc>
           <w:tcPr>
-            <w:tcW w:w="3081" w:type="dxa"/>
+            <w:tcW w:w="3141" w:type="dxa"/>
           </w:tcPr>
           <w:p>
             <w:pPr>
@@ -13492,7 +13661,7 @@
         </w:tc>
         <w:tc>
           <w:tcPr>
-            <w:tcW w:w="5990" w:type="dxa"/>
+            <w:tcW w:w="5930" w:type="dxa"/>
           </w:tcPr>
           <w:p>
             <w:pPr>
@@ -13511,7 +13680,7 @@
         </w:trPr>
         <w:tc>
           <w:tcPr>
-            <w:tcW w:w="3081" w:type="dxa"/>
+            <w:tcW w:w="3141" w:type="dxa"/>
           </w:tcPr>
           <w:p>
             <w:pPr>
@@ -13525,7 +13694,7 @@
         </w:tc>
         <w:tc>
           <w:tcPr>
-            <w:tcW w:w="5990" w:type="dxa"/>
+            <w:tcW w:w="5930" w:type="dxa"/>
           </w:tcPr>
           <w:p>
             <w:pPr>
@@ -13544,7 +13713,7 @@
         </w:trPr>
         <w:tc>
           <w:tcPr>
-            <w:tcW w:w="3081" w:type="dxa"/>
+            <w:tcW w:w="3141" w:type="dxa"/>
           </w:tcPr>
           <w:p>
             <w:pPr>
@@ -13558,15 +13727,18 @@
         </w:tc>
         <w:tc>
           <w:tcPr>
-            <w:tcW w:w="5990" w:type="dxa"/>
-          </w:tcPr>
-          <w:p>
-            <w:pPr>
-              <w:pStyle w:val="Tabela"/>
-              <w:keepNext/>
-            </w:pPr>
-            <w:r>
-              <w:t>O administrador está autenticado.</w:t>
+            <w:tcW w:w="5930" w:type="dxa"/>
+          </w:tcPr>
+          <w:p>
+            <w:pPr>
+              <w:pStyle w:val="Tabela"/>
+              <w:keepNext/>
+            </w:pPr>
+            <w:r>
+              <w:t xml:space="preserve">O </w:t>
+            </w:r>
+            <w:r>
+              <w:t>administrador está autenticado.</w:t>
             </w:r>
           </w:p>
         </w:tc>
@@ -13577,7 +13749,7 @@
         </w:trPr>
         <w:tc>
           <w:tcPr>
-            <w:tcW w:w="3081" w:type="dxa"/>
+            <w:tcW w:w="3141" w:type="dxa"/>
           </w:tcPr>
           <w:p>
             <w:pPr>
@@ -13591,27 +13763,24 @@
         </w:tc>
         <w:tc>
           <w:tcPr>
-            <w:tcW w:w="5990" w:type="dxa"/>
-          </w:tcPr>
-          <w:p>
-            <w:pPr>
-              <w:pStyle w:val="Tabela"/>
-              <w:keepNext/>
-            </w:pPr>
-            <w:r>
-              <w:t>1. O administrador cadastra usuários individualmente ou importa uma lista.</w:t>
-            </w:r>
-          </w:p>
-          <w:p>
-            <w:pPr>
-              <w:pStyle w:val="Tabela"/>
-              <w:keepNext/>
-            </w:pPr>
-            <w:r>
-              <w:t xml:space="preserve">2. O administrador define os perfis, o curso e o </w:t>
-            </w:r>
-            <w:r>
-              <w:t>semestre de cada aluno e os setores de cada atendente.</w:t>
+            <w:tcW w:w="5930" w:type="dxa"/>
+          </w:tcPr>
+          <w:p>
+            <w:pPr>
+              <w:pStyle w:val="Tabela"/>
+              <w:keepNext/>
+            </w:pPr>
+            <w:r>
+              <w:t>1. O administrador cadastra os usuários um a um ou importa uma lista.</w:t>
+            </w:r>
+          </w:p>
+          <w:p>
+            <w:pPr>
+              <w:pStyle w:val="Tabela"/>
+              <w:keepNext/>
+            </w:pPr>
+            <w:r>
+              <w:t>2. O administrador define os perfis, o curso e o semestre de cada aluno e os setores de cada atendente.</w:t>
             </w:r>
           </w:p>
           <w:p>
@@ -13631,7 +13800,7 @@
         </w:trPr>
         <w:tc>
           <w:tcPr>
-            <w:tcW w:w="3081" w:type="dxa"/>
+            <w:tcW w:w="3141" w:type="dxa"/>
           </w:tcPr>
           <w:p>
             <w:pPr>
@@ -13645,7 +13814,7 @@
         </w:tc>
         <w:tc>
           <w:tcPr>
-            <w:tcW w:w="5990" w:type="dxa"/>
+            <w:tcW w:w="5930" w:type="dxa"/>
           </w:tcPr>
           <w:p>
             <w:pPr>
@@ -13662,7 +13831,7 @@
               <w:keepNext/>
             </w:pPr>
             <w:r>
-              <w:t>3a. O administrador desativa um usuário: o acesso é bloqueado, e o histórico permanece.</w:t>
+              <w:t>3a. O administrador desativa um usuário: o acesso é bloqueado, e o histórico continua no sistema.</w:t>
             </w:r>
           </w:p>
         </w:tc>
@@ -13673,7 +13842,7 @@
         </w:trPr>
         <w:tc>
           <w:tcPr>
-            <w:tcW w:w="3081" w:type="dxa"/>
+            <w:tcW w:w="3141" w:type="dxa"/>
           </w:tcPr>
           <w:p>
             <w:pPr>
@@ -13687,15 +13856,18 @@
         </w:tc>
         <w:tc>
           <w:tcPr>
-            <w:tcW w:w="5990" w:type="dxa"/>
-          </w:tcPr>
-          <w:p>
-            <w:pPr>
-              <w:pStyle w:val="Tabela"/>
-              <w:keepNext/>
-            </w:pPr>
-            <w:r>
-              <w:t>As contas estão ativas, com os perfis definidos.</w:t>
+            <w:tcW w:w="5930" w:type="dxa"/>
+          </w:tcPr>
+          <w:p>
+            <w:pPr>
+              <w:pStyle w:val="Tabela"/>
+              <w:keepNext/>
+            </w:pPr>
+            <w:r>
+              <w:t xml:space="preserve">As contas estão ativas, com os perfis </w:t>
+            </w:r>
+            <w:r>
+              <w:t>definidos.</w:t>
             </w:r>
           </w:p>
         </w:tc>
@@ -13706,7 +13878,7 @@
         </w:trPr>
         <w:tc>
           <w:tcPr>
-            <w:tcW w:w="3081" w:type="dxa"/>
+            <w:tcW w:w="3141" w:type="dxa"/>
           </w:tcPr>
           <w:p>
             <w:pPr>
@@ -13720,7 +13892,7 @@
         </w:tc>
         <w:tc>
           <w:tcPr>
-            <w:tcW w:w="5990" w:type="dxa"/>
+            <w:tcW w:w="5930" w:type="dxa"/>
           </w:tcPr>
           <w:p>
             <w:pPr>
@@ -13830,10 +14002,7 @@
               <w:keepNext/>
             </w:pPr>
             <w:r>
-              <w:t xml:space="preserve">Configurar setores, </w:t>
-            </w:r>
-            <w:r>
-              <w:t>categorias e roteamento</w:t>
+              <w:t>Configurar setores, categorias e roteamento</w:t>
             </w:r>
           </w:p>
         </w:tc>
@@ -13950,10 +14119,10 @@
               <w:keepNext/>
             </w:pPr>
             <w:r>
-              <w:t xml:space="preserve">3. O </w:t>
-            </w:r>
-            <w:r>
-              <w:t>administrador define, para cada categoria, o destino: um setor fixo ou a coordenação do curso do aluno.</w:t>
+              <w:t xml:space="preserve">3. O administrador define o destino de cada categoria: um setor fixo ou a coordenação do </w:t>
+            </w:r>
+            <w:r>
+              <w:t>curso do aluno.</w:t>
             </w:r>
           </w:p>
           <w:p>
@@ -14028,7 +14197,7 @@
               <w:keepNext/>
             </w:pPr>
             <w:r>
-              <w:t>A configuração tem exatamente um setor de triagem e uma regra por categoria configurada.</w:t>
+              <w:t>A configuração tem exatamente um setor de triagem e uma regra para cada categoria configurada.</w:t>
             </w:r>
           </w:p>
         </w:tc>
@@ -14390,10 +14559,7 @@
         <w:pStyle w:val="Legenda"/>
       </w:pPr>
       <w:r>
-        <w:t xml:space="preserve">Quadro 24 – </w:t>
-      </w:r>
-      <w:r>
-        <w:t>Especificação do caso de uso UC-12</w:t>
+        <w:t>Quadro 24 – Especificação do caso de uso UC-12</w:t>
       </w:r>
     </w:p>
     <w:tbl>
@@ -14476,7 +14642,10 @@
               <w:keepNext/>
             </w:pPr>
             <w:r>
-              <w:t>Encerrar conversas e chamados por prazo</w:t>
+              <w:t xml:space="preserve">Encerrar conversas e chamados por </w:t>
+            </w:r>
+            <w:r>
+              <w:t>prazo</w:t>
             </w:r>
           </w:p>
         </w:tc>
@@ -14542,10 +14711,7 @@
               <w:keepNext/>
             </w:pPr>
             <w:r>
-              <w:t xml:space="preserve">Há conversa sem desfecho além da janela de inatividade (premissa Q6) ou chamado Resolvido além do prazo de </w:t>
-            </w:r>
-            <w:r>
-              <w:t>confirmação (premissa Q7).</w:t>
+              <w:t>Existe conversa sem desfecho além da janela de inatividade (premissa Q6) ou chamado Resolvido além do prazo de confirmação (premissa Q7).</w:t>
             </w:r>
           </w:p>
         </w:tc>
@@ -14587,7 +14753,10 @@
               <w:keepNext/>
             </w:pPr>
             <w:r>
-              <w:t>2. O sistema encerra as conversas inativas como abandonadas.</w:t>
+              <w:t xml:space="preserve">2. O sistema </w:t>
+            </w:r>
+            <w:r>
+              <w:t>encerra as conversas inativas como abandonadas.</w:t>
             </w:r>
           </w:p>
           <w:p>
@@ -14713,7 +14882,7 @@
       <w:pPr>
         <w:pStyle w:val="Heading2"/>
       </w:pPr>
-      <w:bookmarkStart w:id="23" w:name="_Toc241855273"/>
+      <w:bookmarkStart w:id="23" w:name="_Toc241857854"/>
       <w:r>
         <w:t>5.3 DIAGRAMA DE CLASSES</w:t>
       </w:r>
@@ -14721,7 +14890,7 @@
     </w:p>
     <w:p>
       <w:r>
-        <w:t>A Figura 2 mostra as classes do domínio, seus atributos e associações. A classe VinculoCurso guarda o semestre do aluno em cada curso (premissa Q19), e a classe MensagemConversa aponta para a versão do artigo exibida, o que preserva o histórico quando o artigo é editado (RF-10). Os tipos enumerados usados nos atributos estão no Quadro 25.</w:t>
+        <w:t>A Figura 2 mostra as classes do domínio, com seus atributos e associações. A classe VinculoCurso guarda o semestre do aluno em cada curso (premissa Q19), e a classe MensagemConversa aponta para a versão do artigo que foi exibida, o que preserva o histórico mesmo quando o artigo é editado depois (RF-10). Os tipos enumerados usados nos atributos estão no Quadro 25.</w:t>
       </w:r>
     </w:p>
     <w:p>
@@ -14743,8 +14912,8 @@
           <w:noProof/>
         </w:rPr>
         <w:drawing>
-          <wp:inline distT="0" distB="0" distL="0" distR="0" wp14:anchorId="69FE8AF7" wp14:editId="6526179F">
-            <wp:extent cx="5760000" cy="4842905"/>
+          <wp:inline distT="0" distB="0" distL="0" distR="0" wp14:anchorId="68767940" wp14:editId="241689E8">
+            <wp:extent cx="5760000" cy="5988209"/>
             <wp:effectExtent l="0" t="0" r="0" b="0"/>
             <wp:docPr id="3" name="Picture 3"/>
             <wp:cNvGraphicFramePr>
@@ -14766,7 +14935,7 @@
                   <pic:spPr>
                     <a:xfrm>
                       <a:off x="0" y="0"/>
-                      <a:ext cx="5760000" cy="4842905"/>
+                      <a:ext cx="5760000" cy="5988209"/>
                     </a:xfrm>
                     <a:prstGeom prst="rect">
                       <a:avLst/>
@@ -15008,10 +15177,7 @@
               <w:keepNext/>
             </w:pPr>
             <w:r>
-              <w:t xml:space="preserve">CONFIRMADO, </w:t>
-            </w:r>
-            <w:r>
-              <w:t>FECHADO_AUTOMATICAMENTE, CANCELADO</w:t>
+              <w:t>CONFIRMADO, FECHADO_AUTOMATICAMENTE, CANCELADO</w:t>
             </w:r>
           </w:p>
         </w:tc>
@@ -15095,18 +15261,16 @@
       <w:pPr>
         <w:pStyle w:val="Heading2"/>
       </w:pPr>
-      <w:bookmarkStart w:id="24" w:name="_Toc241855274"/>
+      <w:bookmarkStart w:id="24" w:name="_Toc241857855"/>
       <w:r>
+        <w:lastRenderedPageBreak/>
         <w:t>5.4 MODELO CONCEITUAL</w:t>
       </w:r>
       <w:bookmarkEnd w:id="24"/>
     </w:p>
     <w:p>
       <w:r>
-        <w:t xml:space="preserve">A Figura 3 apresenta o modelo conceitual de dados na notação de </w:t>
-      </w:r>
-      <w:r>
-        <w:t>entidades e relacionamentos. Cada conversa gera no máximo um chamado, cada chamado está em exatamente um setor e cada artigo tem uma ou mais versões.</w:t>
+        <w:t>A Figura 3 traz o modelo conceitual de dados, na notação de entidades e relacionamentos, com a cardinalidade no formato (mínimo, máximo) e o identificador de cada entidade marcado pelo círculo preenchido. Nele, cada conversa gera no máximo um chamado, cada chamado fica em exatamente um setor e cada artigo tem uma ou mais versões. Para manter a figura legível, os demais atributos aparecem no diagrama de classes (Figura 2) e no modelo lógico (Figura 4).</w:t>
       </w:r>
     </w:p>
     <w:p>
@@ -15115,7 +15279,6 @@
         <w:jc w:val="center"/>
       </w:pPr>
       <w:r>
-        <w:lastRenderedPageBreak/>
         <w:t>Figura 3 – Modelo conceitual de dados</w:t>
       </w:r>
     </w:p>
@@ -15128,8 +15291,8 @@
           <w:noProof/>
         </w:rPr>
         <w:drawing>
-          <wp:inline distT="0" distB="0" distL="0" distR="0" wp14:anchorId="01650C34" wp14:editId="1C91C769">
-            <wp:extent cx="5760000" cy="6236690"/>
+          <wp:inline distT="0" distB="0" distL="0" distR="0" wp14:anchorId="0FB55436" wp14:editId="3A6C67AC">
+            <wp:extent cx="5760000" cy="3416374"/>
             <wp:effectExtent l="0" t="0" r="0" b="0"/>
             <wp:docPr id="4" name="Picture 4"/>
             <wp:cNvGraphicFramePr>
@@ -15151,7 +15314,7 @@
                   <pic:spPr>
                     <a:xfrm>
                       <a:off x="0" y="0"/>
-                      <a:ext cx="5760000" cy="6236690"/>
+                      <a:ext cx="5760000" cy="3416374"/>
                     </a:xfrm>
                     <a:prstGeom prst="rect">
                       <a:avLst/>
@@ -15177,7 +15340,7 @@
       <w:pPr>
         <w:pStyle w:val="Heading2"/>
       </w:pPr>
-      <w:bookmarkStart w:id="25" w:name="_Toc241855275"/>
+      <w:bookmarkStart w:id="25" w:name="_Toc241857856"/>
       <w:r>
         <w:t>5.5 MODELO LÓGICO</w:t>
       </w:r>
@@ -15185,11 +15348,10 @@
     </w:p>
     <w:p>
       <w:r>
-        <w:t xml:space="preserve">A Figura 4 apresenta o modelo lógico para o banco de dados PostgreSQL, com chaves primárias (PK), estrangeiras (FK) e únicas (UK). Os relacionamentos muitos-para-muitos do modelo conceitual se tornam as tabelas aluno_curso e atendente_setor, e os perfis do usuário ficam na tabela usuario_papel. O número do chamado é único e gerado por sequência (RF-17), cada conversa tem no máximo um chamado (chave única em chamado.conversa_id) e a </w:t>
+        <w:t>A Figura 4 mostra o modelo lógico para o banco de dados PostgreSQL, com as chaves primárias (PK), estrangeiras (FK) e únicas (UK). Os relacionamentos muitos-para-muitos do modelo conceitual viraram as tabelas aluno_curso e atendente_setor, e os perfis do usuário ficam na tabela usuario_papel. Algumas regras dos requisitos ficam garantidas pelo próprio banco. O número do chamado é único e gerado por sequência (RF-17). A chave única em chamado.conversa_id impede que uma conversa tenha mais de um chamado. Um í</w:t>
       </w:r>
       <w:r>
-        <w:lastRenderedPageBreak/>
-        <w:t>exigência de um único setor de triagem (RF-20) é garantida por um índice único parcial sobre setor.triagem.</w:t>
+        <w:t>ndice único parcial sobre setor.triagem impede que exista mais de um setor de triagem (RF-20).</w:t>
       </w:r>
     </w:p>
     <w:p>
@@ -15198,6 +15360,7 @@
         <w:jc w:val="center"/>
       </w:pPr>
       <w:r>
+        <w:lastRenderedPageBreak/>
         <w:t>Figura 4 – Modelo lógico de dados</w:t>
       </w:r>
     </w:p>
@@ -15210,8 +15373,8 @@
           <w:noProof/>
         </w:rPr>
         <w:drawing>
-          <wp:inline distT="0" distB="0" distL="0" distR="0" wp14:anchorId="1F9BDA8B" wp14:editId="391BCBD8">
-            <wp:extent cx="5760000" cy="4658165"/>
+          <wp:inline distT="0" distB="0" distL="0" distR="0" wp14:anchorId="6BD1F2F8" wp14:editId="70630ADA">
+            <wp:extent cx="5760000" cy="4257720"/>
             <wp:effectExtent l="0" t="0" r="0" b="0"/>
             <wp:docPr id="5" name="Picture 5"/>
             <wp:cNvGraphicFramePr>
@@ -15233,7 +15396,7 @@
                   <pic:spPr>
                     <a:xfrm>
                       <a:off x="0" y="0"/>
-                      <a:ext cx="5760000" cy="4658165"/>
+                      <a:ext cx="5760000" cy="4257720"/>
                     </a:xfrm>
                     <a:prstGeom prst="rect">
                       <a:avLst/>
@@ -15259,7 +15422,7 @@
       <w:pPr>
         <w:pStyle w:val="Heading1"/>
       </w:pPr>
-      <w:bookmarkStart w:id="26" w:name="_Toc241855276"/>
+      <w:bookmarkStart w:id="26" w:name="_Toc241857857"/>
       <w:r>
         <w:lastRenderedPageBreak/>
         <w:t>6 CONSIDERAÇÕES FINAIS</w:t>
@@ -15268,23 +15431,32 @@
     </w:p>
     <w:p>
       <w:r>
-        <w:t xml:space="preserve">O levantamento confirmou que o problema existe e chega à coordenação: cerca de 256 mensagens de alunos em uma semana, metade delas com demandas reais, atendidas uma de cada vez. Também mostrou que boa parte das demandas já tem solução conhecida, no Portal do Aluno ou em uma regra fixa, e que o maior custo de cada atendimento está em localizar os dados do aluno. Os requisitos especificados respondem a esses pontos: o assistente responde o que já tem resposta, o chamado chega ao setor com o contexto completo </w:t>
+        <w:t>O levantamento confirmou que o problema existe e chega até a coordenação: foram cerca de 256 mensagens de alunos em uma semana, metade com demandas reais, atendidas uma de cada vez. Ele também mostrou que boa parte dessas demandas já tem solução conhecida, no Portal do Aluno ou em uma regra fixa, e que o que mais pesa em cada atendimento é encontrar os dados do aluno. Os requisitos que especificamos partem desses pontos. O assistente responde o que já tem resposta, o chamado chega ao setor com o contexto co</w:t>
       </w:r>
       <w:r>
-        <w:t>e todo atendimento fica registrado.</w:t>
+        <w:t>mpleto e todo atendimento fica registrado.</w:t>
       </w:r>
     </w:p>
     <w:p>
       <w:r>
-        <w:t xml:space="preserve">Permanecem em aberto as questões Q5 a Q19, tratadas como premissas no Quadro 1, além da </w:t>
+        <w:t xml:space="preserve">Continuam em aberto as questões Q5 a Q19, tratadas como premissas no Quadro 1, além da unidade das horas de atendimento, do período dos 83 e-mails e do volume de cada tipo de demanda. Vamos enviar essas questões à coordenação, e cada resposta diferente da premissa vai entrar em uma nova versão deste documento. A escolha do ASP.NET Core para o </w:t>
       </w:r>
       <w:r>
-        <w:t>unidade das horas de atendimento, do período dos 83 e-mails e do volume de cada tipo de demanda. Essas questões serão enviadas à coordenação, e cada resposta diferente da premissa será incorporada a uma nova versão deste documento. A escolha de ASP.NET Core para o back-end se apoia na seção 2.1.4 do manual, que admite outras tecnologias além de PHP, Java e Node.js, e será confirmada com o professor orientador.</w:t>
+        <w:rPr>
+          <w:i/>
+        </w:rPr>
+        <w:t>back-end</w:t>
+      </w:r>
+      <w:r>
+        <w:t xml:space="preserve"> se apoia na seção 2.1.4 do manual, que aceita outras tecnologias além de PHP, Java e Node.js, e ainda vamos confirmar isso com o professor orientador.</w:t>
       </w:r>
     </w:p>
     <w:p>
       <w:r>
-        <w:t>Os próximos passos seguem o calendário da disciplina: demonstração das funcionalidades implementadas de 27/10 a 30/10, com a documentação postada no AVA em 30/10; primeira versão do projeto no AVA em 13/11; aplicação disponível para a banca em 20/11; e entrega final, com documentação e código-fonte no GitHub, em 27/11.</w:t>
+        <w:t xml:space="preserve">Os próximos passos seguem o calendário da disciplina. De 27/10 a 30/10 apresentamos as funcionalidades implementadas e, em 30/10, </w:t>
+      </w:r>
+      <w:r>
+        <w:t>postamos a documentação no AVA. Em 13/11 a primeira versão do projeto vai para o AVA, e em 20/11 a aplicação fica disponível para a banca. A entrega final, com a documentação e o código-fonte no GitHub, é em 27/11.</w:t>
       </w:r>
     </w:p>
     <w:p>
@@ -15292,7 +15464,7 @@
         <w:pStyle w:val="Heading1"/>
         <w:jc w:val="center"/>
       </w:pPr>
-      <w:bookmarkStart w:id="27" w:name="_Toc241855277"/>
+      <w:bookmarkStart w:id="27" w:name="_Toc241857858"/>
       <w:r>
         <w:lastRenderedPageBreak/>
         <w:t>REFERÊNCIAS</w:t>
@@ -15619,31 +15791,31 @@
       </w:rPr>
     </w:lvl>
   </w:abstractNum>
-  <w:num w:numId="1" w16cid:durableId="1821926586">
+  <w:num w:numId="1" w16cid:durableId="874467982">
     <w:abstractNumId w:val="8"/>
   </w:num>
-  <w:num w:numId="2" w16cid:durableId="1284461943">
+  <w:num w:numId="2" w16cid:durableId="1100564050">
     <w:abstractNumId w:val="6"/>
   </w:num>
-  <w:num w:numId="3" w16cid:durableId="166678040">
+  <w:num w:numId="3" w16cid:durableId="1140265224">
     <w:abstractNumId w:val="5"/>
   </w:num>
-  <w:num w:numId="4" w16cid:durableId="1696156601">
+  <w:num w:numId="4" w16cid:durableId="2126657081">
     <w:abstractNumId w:val="4"/>
   </w:num>
-  <w:num w:numId="5" w16cid:durableId="1325746742">
+  <w:num w:numId="5" w16cid:durableId="631910567">
     <w:abstractNumId w:val="7"/>
   </w:num>
-  <w:num w:numId="6" w16cid:durableId="330642514">
+  <w:num w:numId="6" w16cid:durableId="357312320">
     <w:abstractNumId w:val="3"/>
   </w:num>
-  <w:num w:numId="7" w16cid:durableId="1920477245">
+  <w:num w:numId="7" w16cid:durableId="1634403206">
     <w:abstractNumId w:val="2"/>
   </w:num>
-  <w:num w:numId="8" w16cid:durableId="759566729">
+  <w:num w:numId="8" w16cid:durableId="1230916962">
     <w:abstractNumId w:val="1"/>
   </w:num>
-  <w:num w:numId="9" w16cid:durableId="8610530">
+  <w:num w:numId="9" w16cid:durableId="1787770882">
     <w:abstractNumId w:val="0"/>
   </w:num>
 </w:numbering>
@@ -27130,7 +27302,7 @@
     <w:autoRedefine/>
     <w:uiPriority w:val="39"/>
     <w:unhideWhenUsed/>
-    <w:rsid w:val="00ED60EE"/>
+    <w:rsid w:val="003B6084"/>
     <w:pPr>
       <w:spacing w:after="100"/>
     </w:pPr>
@@ -27142,7 +27314,7 @@
     <w:autoRedefine/>
     <w:uiPriority w:val="39"/>
     <w:unhideWhenUsed/>
-    <w:rsid w:val="00ED60EE"/>
+    <w:rsid w:val="003B6084"/>
     <w:pPr>
       <w:spacing w:after="100"/>
       <w:ind w:left="240"/>
@@ -27153,7 +27325,7 @@
     <w:basedOn w:val="DefaultParagraphFont"/>
     <w:uiPriority w:val="99"/>
     <w:unhideWhenUsed/>
-    <w:rsid w:val="00ED60EE"/>
+    <w:rsid w:val="003B6084"/>
     <w:rPr>
       <w:color w:val="0000FF" w:themeColor="hyperlink"/>
       <w:u w:val="single"/>

</xml_diff>